<commit_message>
Refine midterm report focus and table style
</commit_message>
<xml_diff>
--- a/paper_assets/reports/中期报告_完善版.docx
+++ b/paper_assets/reports/中期报告_完善版.docx
@@ -1392,72 +1392,7 @@
         <w:ind w:firstLineChars="200" w:firstLine="480"/>
       </w:pPr>
       <w:r>
-        <w:rPr>
-          <w:rFonts w:hint="eastAsia"/>
-        </w:rPr>
-        <w:t>第</w:t>
-      </w:r>
-      <w:r>
-        <w:rPr>
-          <w:rFonts w:hint="eastAsia"/>
-        </w:rPr>
-        <w:t>十二</w:t>
-      </w:r>
-      <w:r>
-        <w:rPr>
-          <w:rFonts w:hint="eastAsia"/>
-        </w:rPr>
-        <w:t>～十</w:t>
-      </w:r>
-      <w:r>
-        <w:rPr>
-          <w:rFonts w:hint="eastAsia"/>
-        </w:rPr>
-        <w:t>四</w:t>
-      </w:r>
-      <w:r>
-        <w:rPr>
-          <w:rFonts w:hint="eastAsia"/>
-        </w:rPr>
-        <w:t>周：</w:t>
-      </w:r>
-      <w:r>
-        <w:rPr>
-          <w:szCs w:val="21"/>
-        </w:rPr>
-        <w:t>完成对称结构理论分析</w:t>
-      </w:r>
-      <w:r>
-        <w:rPr>
-          <w:rFonts w:hint="eastAsia"/>
-          <w:szCs w:val="21"/>
-        </w:rPr>
-        <w:t>，</w:t>
-      </w:r>
-      <w:r>
-        <w:rPr>
-          <w:szCs w:val="21"/>
-        </w:rPr>
-        <w:t>推广到卷积结构</w:t>
-      </w:r>
-      <w:r>
-        <w:rPr>
-          <w:rFonts w:hint="eastAsia"/>
-          <w:szCs w:val="21"/>
-        </w:rPr>
-        <w:t>，</w:t>
-      </w:r>
-      <w:r>
-        <w:rPr>
-          <w:szCs w:val="21"/>
-        </w:rPr>
-        <w:t>进行数值实验验证</w:t>
-      </w:r>
-      <w:r>
-        <w:rPr>
-          <w:rFonts w:hint="eastAsia"/>
-        </w:rPr>
-        <w:t>；</w:t>
+        <w:t>第十二～十四周：完成对称结构理论分析，推广到更一般的对称局部预测结构，进行数值实验验证；</w:t>
       </w:r>
     </w:p>
     <w:p>
@@ -18492,7 +18427,7 @@
     <w:p>
       <w:pPr/>
       <w:r>
-        <w:t>在原有理论推导与收敛性实验基础上，本阶段进一步整理了 ThreeQ、EPThreeQ、DThreeQ、CNNThreeQ/EPCNNThreeQ 的可比较实验结果。整体上看，理论稳定性已经有较清晰证据，但训练有效性、更新方向与高维视觉任务上的泛化能力仍是后续工作的主要瓶颈。</w:t>
+        <w:t>在原有理论推导与收敛性实验基础上，本阶段进一步整理了 ThreeQ、EPThreeQ 与 DThreeQ 的可比较实验结果。考虑到当前仍有若干实验路线尚不充分，报告正文重点放在理论闭环较清楚、实验效果相对较好的部分：inference 收敛性验证、EPThreeQ 的稳定提升，以及 DThreeQ 在 CE-style 输出监督和 full-data restore-best 设置下的性能改进。</w:t>
       </w:r>
     </w:p>
     <w:p>
@@ -18536,6 +18471,7 @@
     </w:p>
     <w:p>
       <w:pPr>
+        <w:pStyle w:val="a9"/>
         <w:jc w:val="center"/>
       </w:pPr>
       <w:r>
@@ -18544,8 +18480,9 @@
     </w:p>
     <w:tbl>
       <w:tblPr>
-        <w:tblStyle w:val="ac"/>
         <w:tblW w:type="auto" w:w="0"/>
+        <w:jc w:val="center"/>
+        <w:tblLayout w:type="autofit"/>
         <w:tblLook w:firstColumn="1" w:firstRow="1" w:lastColumn="0" w:lastRow="0" w:noHBand="0" w:noVBand="1" w:val="04A0"/>
       </w:tblPr>
       <w:tblGrid>
@@ -18560,7 +18497,13 @@
             <w:tcW w:type="dxa" w:w="2232"/>
           </w:tcPr>
           <w:p>
+            <w:pPr>
+              <w:jc w:val="center"/>
+            </w:pPr>
             <w:r>
+              <w:rPr>
+                <w:b/>
+              </w:rPr>
               <w:t>模型/实验</w:t>
             </w:r>
           </w:p>
@@ -18570,7 +18513,13 @@
             <w:tcW w:type="dxa" w:w="2232"/>
           </w:tcPr>
           <w:p>
+            <w:pPr>
+              <w:jc w:val="center"/>
+            </w:pPr>
             <w:r>
+              <w:rPr>
+                <w:b/>
+              </w:rPr>
               <w:t>设置</w:t>
             </w:r>
           </w:p>
@@ -18580,7 +18529,13 @@
             <w:tcW w:type="dxa" w:w="2232"/>
           </w:tcPr>
           <w:p>
+            <w:pPr>
+              <w:jc w:val="center"/>
+            </w:pPr>
             <w:r>
+              <w:rPr>
+                <w:b/>
+              </w:rPr>
               <w:t>主要结果</w:t>
             </w:r>
           </w:p>
@@ -18590,7 +18545,13 @@
             <w:tcW w:type="dxa" w:w="2232"/>
           </w:tcPr>
           <w:p>
+            <w:pPr>
+              <w:jc w:val="center"/>
+            </w:pPr>
             <w:r>
+              <w:rPr>
+                <w:b/>
+              </w:rPr>
               <w:t>结论</w:t>
             </w:r>
           </w:p>
@@ -18602,6 +18563,9 @@
             <w:tcW w:type="dxa" w:w="2232"/>
           </w:tcPr>
           <w:p>
+            <w:pPr>
+              <w:jc w:val="center"/>
+            </w:pPr>
             <w:r>
               <w:t>Base3Q legacy</w:t>
             </w:r>
@@ -18612,6 +18576,9 @@
             <w:tcW w:type="dxa" w:w="2232"/>
           </w:tcPr>
           <w:p>
+            <w:pPr>
+              <w:jc w:val="center"/>
+            </w:pPr>
             <w:r>
               <w:t>MNIST 5k/1k, 8 epoch</w:t>
             </w:r>
@@ -18622,6 +18589,9 @@
             <w:tcW w:type="dxa" w:w="2232"/>
           </w:tcPr>
           <w:p>
+            <w:pPr>
+              <w:jc w:val="center"/>
+            </w:pPr>
             <w:r>
               <w:t>60.2% best valid accuracy</w:t>
             </w:r>
@@ -18632,6 +18602,9 @@
             <w:tcW w:type="dxa" w:w="2232"/>
           </w:tcPr>
           <w:p>
+            <w:pPr>
+              <w:jc w:val="center"/>
+            </w:pPr>
             <w:r>
               <w:t>原始 ThreeQ 可学习但收敛较慢</w:t>
             </w:r>
@@ -18644,6 +18617,9 @@
             <w:tcW w:type="dxa" w:w="2232"/>
           </w:tcPr>
           <w:p>
+            <w:pPr>
+              <w:jc w:val="center"/>
+            </w:pPr>
             <w:r>
               <w:t>EPBase3Q legacy</w:t>
             </w:r>
@@ -18654,6 +18630,9 @@
             <w:tcW w:type="dxa" w:w="2232"/>
           </w:tcPr>
           <w:p>
+            <w:pPr>
+              <w:jc w:val="center"/>
+            </w:pPr>
             <w:r>
               <w:t>MNIST 5k/1k, 8 epoch</w:t>
             </w:r>
@@ -18664,6 +18643,9 @@
             <w:tcW w:type="dxa" w:w="2232"/>
           </w:tcPr>
           <w:p>
+            <w:pPr>
+              <w:jc w:val="center"/>
+            </w:pPr>
             <w:r>
               <w:t>77.5% best valid accuracy</w:t>
             </w:r>
@@ -18674,6 +18656,9 @@
             <w:tcW w:type="dxa" w:w="2232"/>
           </w:tcPr>
           <w:p>
+            <w:pPr>
+              <w:jc w:val="center"/>
+            </w:pPr>
             <w:r>
               <w:t>EP 明显优于 direct</w:t>
             </w:r>
@@ -18686,6 +18671,9 @@
             <w:tcW w:type="dxa" w:w="2232"/>
           </w:tcPr>
           <w:p>
+            <w:pPr>
+              <w:jc w:val="center"/>
+            </w:pPr>
             <w:r>
               <w:t>EPBase3Q tune</w:t>
             </w:r>
@@ -18696,6 +18684,9 @@
             <w:tcW w:type="dxa" w:w="2232"/>
           </w:tcPr>
           <w:p>
+            <w:pPr>
+              <w:jc w:val="center"/>
+            </w:pPr>
             <w:r>
               <w:t>MNIST 10k/2k, 15 epoch</w:t>
             </w:r>
@@ -18706,6 +18697,9 @@
             <w:tcW w:type="dxa" w:w="2232"/>
           </w:tcPr>
           <w:p>
+            <w:pPr>
+              <w:jc w:val="center"/>
+            </w:pPr>
             <w:r>
               <w:t>86.5% best valid accuracy</w:t>
             </w:r>
@@ -18716,6 +18710,9 @@
             <w:tcW w:type="dxa" w:w="2232"/>
           </w:tcPr>
           <w:p>
+            <w:pPr>
+              <w:jc w:val="center"/>
+            </w:pPr>
             <w:r>
               <w:t>当前最稳的原始 ThreeQ 改进线</w:t>
             </w:r>
@@ -18728,6 +18725,9 @@
             <w:tcW w:type="dxa" w:w="2232"/>
           </w:tcPr>
           <w:p>
+            <w:pPr>
+              <w:jc w:val="center"/>
+            </w:pPr>
             <w:r>
               <w:t>DThreeQ EP-nudge</w:t>
             </w:r>
@@ -18738,6 +18738,9 @@
             <w:tcW w:type="dxa" w:w="2232"/>
           </w:tcPr>
           <w:p>
+            <w:pPr>
+              <w:jc w:val="center"/>
+            </w:pPr>
             <w:r>
               <w:t>MNIST 10k/2k, 30 epoch</w:t>
             </w:r>
@@ -18748,6 +18751,9 @@
             <w:tcW w:type="dxa" w:w="2232"/>
           </w:tcPr>
           <w:p>
+            <w:pPr>
+              <w:jc w:val="center"/>
+            </w:pPr>
             <w:r>
               <w:t>83.9% best accuracy</w:t>
             </w:r>
@@ -18758,6 +18764,9 @@
             <w:tcW w:type="dxa" w:w="2232"/>
           </w:tcPr>
           <w:p>
+            <w:pPr>
+              <w:jc w:val="center"/>
+            </w:pPr>
             <w:r>
               <w:t>DThreeQ 可学习，但仍低于 EPThreeQ tune</w:t>
             </w:r>
@@ -18770,6 +18779,9 @@
             <w:tcW w:type="dxa" w:w="2232"/>
           </w:tcPr>
           <w:p>
+            <w:pPr>
+              <w:jc w:val="center"/>
+            </w:pPr>
             <w:r>
               <w:t>DThreeQ CE-nudge</w:t>
             </w:r>
@@ -18780,6 +18792,9 @@
             <w:tcW w:type="dxa" w:w="2232"/>
           </w:tcPr>
           <w:p>
+            <w:pPr>
+              <w:jc w:val="center"/>
+            </w:pPr>
             <w:r>
               <w:t>MNIST 10k/2k, 30 epoch</w:t>
             </w:r>
@@ -18790,6 +18805,9 @@
             <w:tcW w:type="dxa" w:w="2232"/>
           </w:tcPr>
           <w:p>
+            <w:pPr>
+              <w:jc w:val="center"/>
+            </w:pPr>
             <w:r>
               <w:t>86.5% selected accuracy</w:t>
             </w:r>
@@ -18800,6 +18818,9 @@
             <w:tcW w:type="dxa" w:w="2232"/>
           </w:tcPr>
           <w:p>
+            <w:pPr>
+              <w:jc w:val="center"/>
+            </w:pPr>
             <w:r>
               <w:t>CE-style 输出监督是明确正向改动</w:t>
             </w:r>
@@ -18812,6 +18833,9 @@
             <w:tcW w:type="dxa" w:w="2232"/>
           </w:tcPr>
           <w:p>
+            <w:pPr>
+              <w:jc w:val="center"/>
+            </w:pPr>
             <w:r>
               <w:t>DThreeQ full-data restore-best</w:t>
             </w:r>
@@ -18822,6 +18846,9 @@
             <w:tcW w:type="dxa" w:w="2232"/>
           </w:tcPr>
           <w:p>
+            <w:pPr>
+              <w:jc w:val="center"/>
+            </w:pPr>
             <w:r>
               <w:t>MNIST 60k/10k, 30 epoch</w:t>
             </w:r>
@@ -18832,6 +18859,9 @@
             <w:tcW w:type="dxa" w:w="2232"/>
           </w:tcPr>
           <w:p>
+            <w:pPr>
+              <w:jc w:val="center"/>
+            </w:pPr>
             <w:r>
               <w:t>88.0% selected accuracy</w:t>
             </w:r>
@@ -18842,6 +18872,9 @@
             <w:tcW w:type="dxa" w:w="2232"/>
           </w:tcPr>
           <w:p>
+            <w:pPr>
+              <w:jc w:val="center"/>
+            </w:pPr>
             <w:r>
               <w:t>接近 90%，但 final 回退到约 83.8%</w:t>
             </w:r>
@@ -18912,6 +18945,7 @@
     </w:p>
     <w:p>
       <w:pPr>
+        <w:pStyle w:val="a9"/>
         <w:jc w:val="center"/>
       </w:pPr>
       <w:r>
@@ -18959,6 +18993,7 @@
     </w:p>
     <w:p>
       <w:pPr>
+        <w:pStyle w:val="a9"/>
         <w:jc w:val="center"/>
       </w:pPr>
       <w:r>
@@ -18967,8 +19002,9 @@
     </w:p>
     <w:tbl>
       <w:tblPr>
-        <w:tblStyle w:val="ac"/>
         <w:tblW w:type="auto" w:w="0"/>
+        <w:jc w:val="center"/>
+        <w:tblLayout w:type="autofit"/>
         <w:tblLook w:firstColumn="1" w:firstRow="1" w:lastColumn="0" w:lastRow="0" w:noHBand="0" w:noVBand="1" w:val="04A0"/>
       </w:tblPr>
       <w:tblGrid>
@@ -18985,7 +19021,13 @@
             <w:tcW w:type="dxa" w:w="1488"/>
           </w:tcPr>
           <w:p>
+            <w:pPr>
+              <w:jc w:val="center"/>
+            </w:pPr>
             <w:r>
+              <w:rPr>
+                <w:b/>
+              </w:rPr>
               <w:t>阶段</w:t>
             </w:r>
           </w:p>
@@ -18995,7 +19037,13 @@
             <w:tcW w:type="dxa" w:w="1488"/>
           </w:tcPr>
           <w:p>
+            <w:pPr>
+              <w:jc w:val="center"/>
+            </w:pPr>
             <w:r>
+              <w:rPr>
+                <w:b/>
+              </w:rPr>
               <w:t>变体</w:t>
             </w:r>
           </w:p>
@@ -19005,7 +19053,13 @@
             <w:tcW w:type="dxa" w:w="1488"/>
           </w:tcPr>
           <w:p>
+            <w:pPr>
+              <w:jc w:val="center"/>
+            </w:pPr>
             <w:r>
+              <w:rPr>
+                <w:b/>
+              </w:rPr>
               <w:t>数据预算</w:t>
             </w:r>
           </w:p>
@@ -19015,7 +19069,13 @@
             <w:tcW w:type="dxa" w:w="1488"/>
           </w:tcPr>
           <w:p>
+            <w:pPr>
+              <w:jc w:val="center"/>
+            </w:pPr>
             <w:r>
+              <w:rPr>
+                <w:b/>
+              </w:rPr>
               <w:t>best acc.</w:t>
             </w:r>
           </w:p>
@@ -19025,7 +19085,13 @@
             <w:tcW w:type="dxa" w:w="1488"/>
           </w:tcPr>
           <w:p>
+            <w:pPr>
+              <w:jc w:val="center"/>
+            </w:pPr>
             <w:r>
+              <w:rPr>
+                <w:b/>
+              </w:rPr>
               <w:t>final acc.</w:t>
             </w:r>
           </w:p>
@@ -19035,7 +19101,13 @@
             <w:tcW w:type="dxa" w:w="1488"/>
           </w:tcPr>
           <w:p>
+            <w:pPr>
+              <w:jc w:val="center"/>
+            </w:pPr>
             <w:r>
+              <w:rPr>
+                <w:b/>
+              </w:rPr>
               <w:t>解释</w:t>
             </w:r>
           </w:p>
@@ -19047,6 +19119,9 @@
             <w:tcW w:type="dxa" w:w="1488"/>
           </w:tcPr>
           <w:p>
+            <w:pPr>
+              <w:jc w:val="center"/>
+            </w:pPr>
             <w:r>
               <w:t>small public screen</w:t>
             </w:r>
@@ -19057,6 +19132,9 @@
             <w:tcW w:type="dxa" w:w="1488"/>
           </w:tcPr>
           <w:p>
+            <w:pPr>
+              <w:jc w:val="center"/>
+            </w:pPr>
             <w:r>
               <w:t>dthreeq_ep_nudge_0p01</w:t>
             </w:r>
@@ -19067,6 +19145,9 @@
             <w:tcW w:type="dxa" w:w="1488"/>
           </w:tcPr>
           <w:p>
+            <w:pPr>
+              <w:jc w:val="center"/>
+            </w:pPr>
             <w:r>
               <w:t>3k/1k, 3 epochs</w:t>
             </w:r>
@@ -19077,6 +19158,9 @@
             <w:tcW w:type="dxa" w:w="1488"/>
           </w:tcPr>
           <w:p>
+            <w:pPr>
+              <w:jc w:val="center"/>
+            </w:pPr>
             <w:r>
               <w:t>13.32%</w:t>
             </w:r>
@@ -19087,6 +19171,9 @@
             <w:tcW w:type="dxa" w:w="1488"/>
           </w:tcPr>
           <w:p>
+            <w:pPr>
+              <w:jc w:val="center"/>
+            </w:pPr>
             <w:r>
               <w:t>13.32%</w:t>
             </w:r>
@@ -19097,6 +19184,9 @@
             <w:tcW w:type="dxa" w:w="1488"/>
           </w:tcPr>
           <w:p>
+            <w:pPr>
+              <w:jc w:val="center"/>
+            </w:pPr>
             <w:r>
               <w:t>小预算接近随机，不能代表原始设定</w:t>
             </w:r>
@@ -19109,6 +19199,9 @@
             <w:tcW w:type="dxa" w:w="1488"/>
           </w:tcPr>
           <w:p>
+            <w:pPr>
+              <w:jc w:val="center"/>
+            </w:pPr>
             <w:r>
               <w:t>legacy-scale focus</w:t>
             </w:r>
@@ -19119,6 +19212,9 @@
             <w:tcW w:type="dxa" w:w="1488"/>
           </w:tcPr>
           <w:p>
+            <w:pPr>
+              <w:jc w:val="center"/>
+            </w:pPr>
             <w:r>
               <w:t>dthreeq_ep_nudge0p1_lr1e3</w:t>
             </w:r>
@@ -19129,6 +19225,9 @@
             <w:tcW w:type="dxa" w:w="1488"/>
           </w:tcPr>
           <w:p>
+            <w:pPr>
+              <w:jc w:val="center"/>
+            </w:pPr>
             <w:r>
               <w:t>10k/2k, 12 epochs</w:t>
             </w:r>
@@ -19139,6 +19238,9 @@
             <w:tcW w:type="dxa" w:w="1488"/>
           </w:tcPr>
           <w:p>
+            <w:pPr>
+              <w:jc w:val="center"/>
+            </w:pPr>
             <w:r>
               <w:t>80.35%</w:t>
             </w:r>
@@ -19149,6 +19251,9 @@
             <w:tcW w:type="dxa" w:w="1488"/>
           </w:tcPr>
           <w:p>
+            <w:pPr>
+              <w:jc w:val="center"/>
+            </w:pPr>
             <w:r>
               <w:t>80.35%</w:t>
             </w:r>
@@ -19159,6 +19264,9 @@
             <w:tcW w:type="dxa" w:w="1488"/>
           </w:tcPr>
           <w:p>
+            <w:pPr>
+              <w:jc w:val="center"/>
+            </w:pPr>
             <w:r>
               <w:t>扩大规模后明显可学习</w:t>
             </w:r>
@@ -19171,6 +19279,9 @@
             <w:tcW w:type="dxa" w:w="1488"/>
           </w:tcPr>
           <w:p>
+            <w:pPr>
+              <w:jc w:val="center"/>
+            </w:pPr>
             <w:r>
               <w:t>longrun EP-nudge</w:t>
             </w:r>
@@ -19181,6 +19292,9 @@
             <w:tcW w:type="dxa" w:w="1488"/>
           </w:tcPr>
           <w:p>
+            <w:pPr>
+              <w:jc w:val="center"/>
+            </w:pPr>
             <w:r>
               <w:t>dthreeq_ep_nudge0p1_lr3e3</w:t>
             </w:r>
@@ -19191,6 +19305,9 @@
             <w:tcW w:type="dxa" w:w="1488"/>
           </w:tcPr>
           <w:p>
+            <w:pPr>
+              <w:jc w:val="center"/>
+            </w:pPr>
             <w:r>
               <w:t>10k/2k, 30 epochs</w:t>
             </w:r>
@@ -19201,6 +19318,9 @@
             <w:tcW w:type="dxa" w:w="1488"/>
           </w:tcPr>
           <w:p>
+            <w:pPr>
+              <w:jc w:val="center"/>
+            </w:pPr>
             <w:r>
               <w:t>83.94%</w:t>
             </w:r>
@@ -19211,6 +19331,9 @@
             <w:tcW w:type="dxa" w:w="1488"/>
           </w:tcPr>
           <w:p>
+            <w:pPr>
+              <w:jc w:val="center"/>
+            </w:pPr>
             <w:r>
               <w:t>83.54%</w:t>
             </w:r>
@@ -19221,6 +19344,9 @@
             <w:tcW w:type="dxa" w:w="1488"/>
           </w:tcPr>
           <w:p>
+            <w:pPr>
+              <w:jc w:val="center"/>
+            </w:pPr>
             <w:r>
               <w:t>当前稳定 baseline</w:t>
             </w:r>
@@ -19233,6 +19359,9 @@
             <w:tcW w:type="dxa" w:w="1488"/>
           </w:tcPr>
           <w:p>
+            <w:pPr>
+              <w:jc w:val="center"/>
+            </w:pPr>
             <w:r>
               <w:t>CE-style nudge</w:t>
             </w:r>
@@ -19243,6 +19372,9 @@
             <w:tcW w:type="dxa" w:w="1488"/>
           </w:tcPr>
           <w:p>
+            <w:pPr>
+              <w:jc w:val="center"/>
+            </w:pPr>
             <w:r>
               <w:t>dthreeq_ep_ce_nudge0p1_lr3e3</w:t>
             </w:r>
@@ -19253,6 +19385,9 @@
             <w:tcW w:type="dxa" w:w="1488"/>
           </w:tcPr>
           <w:p>
+            <w:pPr>
+              <w:jc w:val="center"/>
+            </w:pPr>
             <w:r>
               <w:t>10k/2k, 30 epochs</w:t>
             </w:r>
@@ -19263,6 +19398,9 @@
             <w:tcW w:type="dxa" w:w="1488"/>
           </w:tcPr>
           <w:p>
+            <w:pPr>
+              <w:jc w:val="center"/>
+            </w:pPr>
             <w:r>
               <w:t>86.84%</w:t>
             </w:r>
@@ -19273,6 +19411,9 @@
             <w:tcW w:type="dxa" w:w="1488"/>
           </w:tcPr>
           <w:p>
+            <w:pPr>
+              <w:jc w:val="center"/>
+            </w:pPr>
             <w:r>
               <w:t>86.55%</w:t>
             </w:r>
@@ -19283,6 +19424,9 @@
             <w:tcW w:type="dxa" w:w="1488"/>
           </w:tcPr>
           <w:p>
+            <w:pPr>
+              <w:jc w:val="center"/>
+            </w:pPr>
             <w:r>
               <w:t>输出监督改为 CE 后提升明显</w:t>
             </w:r>
@@ -19295,6 +19439,9 @@
             <w:tcW w:type="dxa" w:w="1488"/>
           </w:tcPr>
           <w:p>
+            <w:pPr>
+              <w:jc w:val="center"/>
+            </w:pPr>
             <w:r>
               <w:t>full-data restore-best</w:t>
             </w:r>
@@ -19305,6 +19452,9 @@
             <w:tcW w:type="dxa" w:w="1488"/>
           </w:tcPr>
           <w:p>
+            <w:pPr>
+              <w:jc w:val="center"/>
+            </w:pPr>
             <w:r>
               <w:t>dthreeq_ep_signed_nudge0p1_lr3e3_restorebest</w:t>
             </w:r>
@@ -19315,6 +19465,9 @@
             <w:tcW w:type="dxa" w:w="1488"/>
           </w:tcPr>
           <w:p>
+            <w:pPr>
+              <w:jc w:val="center"/>
+            </w:pPr>
             <w:r>
               <w:t>60k/10k, 30 epochs</w:t>
             </w:r>
@@ -19325,6 +19478,9 @@
             <w:tcW w:type="dxa" w:w="1488"/>
           </w:tcPr>
           <w:p>
+            <w:pPr>
+              <w:jc w:val="center"/>
+            </w:pPr>
             <w:r>
               <w:t>88.03%</w:t>
             </w:r>
@@ -19335,6 +19491,9 @@
             <w:tcW w:type="dxa" w:w="1488"/>
           </w:tcPr>
           <w:p>
+            <w:pPr>
+              <w:jc w:val="center"/>
+            </w:pPr>
             <w:r>
               <w:t>83.79%</w:t>
             </w:r>
@@ -19345,6 +19504,9 @@
             <w:tcW w:type="dxa" w:w="1488"/>
           </w:tcPr>
           <w:p>
+            <w:pPr>
+              <w:jc w:val="center"/>
+            </w:pPr>
             <w:r>
               <w:t>best checkpoint 较好，但 final 回退</w:t>
             </w:r>
@@ -19365,454 +19527,13 @@
         <w:pStyle w:val="3"/>
       </w:pPr>
       <w:r>
-        <w:t>2.2.9 Dplus、BP 与 EP 的机制诊断</w:t>
+        <w:t>2.2.9 输入能量与输出监督分析</w:t>
       </w:r>
     </w:p>
     <w:p>
       <w:pPr/>
       <w:r>
-        <w:t>为了分析 Dplus 是否真正形成了类似 BP 的跨层 credit assignment，本阶段在同一 mini-batch 和同一初始参数上比较了 BP、EP 与 Dplus 的更新向量。诊断指标包括 cosine similarity、norm ratio、sign agreement 和 one-step loss decrease。结果显示，Dplus 与 BP 的 forward cosine 只有约 0.03 到 0.08，sign agreement 接近随机；Dplus 与 EP 在 one-sided plus target 上高度同向但范数严重缩小；plusminus 变体出现明确符号抵消。</w:t>
-      </w:r>
-    </w:p>
-    <w:p>
-      <w:pPr>
-        <w:jc w:val="center"/>
-      </w:pPr>
-      <w:r>
-        <w:drawing>
-          <wp:inline xmlns:a="http://schemas.openxmlformats.org/drawingml/2006/main" xmlns:pic="http://schemas.openxmlformats.org/drawingml/2006/picture">
-            <wp:extent cx="5349240" cy="1493869"/>
-            <wp:docPr id="1667263014" name="Picture 1667263014"/>
-            <wp:cNvGraphicFramePr>
-              <a:graphicFrameLocks noChangeAspect="1"/>
-            </wp:cNvGraphicFramePr>
-            <a:graphic>
-              <a:graphicData uri="http://schemas.openxmlformats.org/drawingml/2006/picture">
-                <pic:pic>
-                  <pic:nvPicPr>
-                    <pic:cNvPr id="0" name="fig06_mechanism_direction_metrics.png"/>
-                    <pic:cNvPicPr/>
-                  </pic:nvPicPr>
-                  <pic:blipFill>
-                    <a:blip r:embed="rId25"/>
-                    <a:stretch>
-                      <a:fillRect/>
-                    </a:stretch>
-                  </pic:blipFill>
-                  <pic:spPr>
-                    <a:xfrm>
-                      <a:off x="0" y="0"/>
-                      <a:ext cx="5349240" cy="1493869"/>
-                    </a:xfrm>
-                    <a:prstGeom prst="rect"/>
-                  </pic:spPr>
-                </pic:pic>
-              </a:graphicData>
-            </a:graphic>
-          </wp:inline>
-        </w:drawing>
-      </w:r>
-    </w:p>
-    <w:p>
-      <w:pPr>
-        <w:jc w:val="center"/>
-      </w:pPr>
-      <w:r>
-        <w:t>图2.12  Dplus、BP、EP 更新向量方向诊断。</w:t>
-      </w:r>
-    </w:p>
-    <w:p>
-      <w:pPr>
-        <w:jc w:val="center"/>
-      </w:pPr>
-      <w:r>
-        <w:drawing>
-          <wp:inline xmlns:a="http://schemas.openxmlformats.org/drawingml/2006/main" xmlns:pic="http://schemas.openxmlformats.org/drawingml/2006/picture">
-            <wp:extent cx="5349240" cy="2211157"/>
-            <wp:docPr id="1667263015" name="Picture 1667263015"/>
-            <wp:cNvGraphicFramePr>
-              <a:graphicFrameLocks noChangeAspect="1"/>
-            </wp:cNvGraphicFramePr>
-            <a:graphic>
-              <a:graphicData uri="http://schemas.openxmlformats.org/drawingml/2006/picture">
-                <pic:pic>
-                  <pic:nvPicPr>
-                    <pic:cNvPr id="0" name="fig07_mechanism_one_step_loss.png"/>
-                    <pic:cNvPicPr/>
-                  </pic:nvPicPr>
-                  <pic:blipFill>
-                    <a:blip r:embed="rId26"/>
-                    <a:stretch>
-                      <a:fillRect/>
-                    </a:stretch>
-                  </pic:blipFill>
-                  <pic:spPr>
-                    <a:xfrm>
-                      <a:off x="0" y="0"/>
-                      <a:ext cx="5349240" cy="2211157"/>
-                    </a:xfrm>
-                    <a:prstGeom prst="rect"/>
-                  </pic:spPr>
-                </pic:pic>
-              </a:graphicData>
-            </a:graphic>
-          </wp:inline>
-        </w:drawing>
-      </w:r>
-    </w:p>
-    <w:p>
-      <w:pPr>
-        <w:jc w:val="center"/>
-      </w:pPr>
-      <w:r>
-        <w:t>图2.13  Dplus one-step loss decrease 与 plusminus 失败模式。</w:t>
-      </w:r>
-    </w:p>
-    <w:tbl>
-      <w:tblPr>
-        <w:tblStyle w:val="ac"/>
-        <w:tblW w:type="auto" w:w="0"/>
-        <w:tblLook w:firstColumn="1" w:firstRow="1" w:lastColumn="0" w:lastRow="0" w:noHBand="0" w:noVBand="1" w:val="04A0"/>
-      </w:tblPr>
-      <w:tblGrid>
-        <w:gridCol w:w="1488"/>
-        <w:gridCol w:w="1488"/>
-        <w:gridCol w:w="1488"/>
-        <w:gridCol w:w="1488"/>
-        <w:gridCol w:w="1488"/>
-        <w:gridCol w:w="1488"/>
-      </w:tblGrid>
-      <w:tr>
-        <w:tc>
-          <w:tcPr>
-            <w:tcW w:type="dxa" w:w="1488"/>
-          </w:tcPr>
-          <w:p>
-            <w:r>
-              <w:t>target</w:t>
-            </w:r>
-          </w:p>
-        </w:tc>
-        <w:tc>
-          <w:tcPr>
-            <w:tcW w:type="dxa" w:w="1488"/>
-          </w:tcPr>
-          <w:p>
-            <w:r>
-              <w:t>Dplus vs BP cosine</w:t>
-            </w:r>
-          </w:p>
-        </w:tc>
-        <w:tc>
-          <w:tcPr>
-            <w:tcW w:type="dxa" w:w="1488"/>
-          </w:tcPr>
-          <w:p>
-            <w:r>
-              <w:t>norm ratio</w:t>
-            </w:r>
-          </w:p>
-        </w:tc>
-        <w:tc>
-          <w:tcPr>
-            <w:tcW w:type="dxa" w:w="1488"/>
-          </w:tcPr>
-          <w:p>
-            <w:r>
-              <w:t>sign agreement</w:t>
-            </w:r>
-          </w:p>
-        </w:tc>
-        <w:tc>
-          <w:tcPr>
-            <w:tcW w:type="dxa" w:w="1488"/>
-          </w:tcPr>
-          <w:p>
-            <w:r>
-              <w:t>Dplus vs EP cosine</w:t>
-            </w:r>
-          </w:p>
-        </w:tc>
-        <w:tc>
-          <w:tcPr>
-            <w:tcW w:type="dxa" w:w="1488"/>
-          </w:tcPr>
-          <w:p>
-            <w:r>
-              <w:t>raw free-MSE decrease</w:t>
-            </w:r>
-          </w:p>
-        </w:tc>
-      </w:tr>
-      <w:tr>
-        <w:tc>
-          <w:tcPr>
-            <w:tcW w:type="dxa" w:w="1488"/>
-          </w:tcPr>
-          <w:p>
-            <w:r>
-              <w:t>direct_plus</w:t>
-            </w:r>
-          </w:p>
-        </w:tc>
-        <w:tc>
-          <w:tcPr>
-            <w:tcW w:type="dxa" w:w="1488"/>
-          </w:tcPr>
-          <w:p>
-            <w:r>
-              <w:t>0.0760</w:t>
-            </w:r>
-          </w:p>
-        </w:tc>
-        <w:tc>
-          <w:tcPr>
-            <w:tcW w:type="dxa" w:w="1488"/>
-          </w:tcPr>
-          <w:p>
-            <w:r>
-              <w:t>0.1705</w:t>
-            </w:r>
-          </w:p>
-        </w:tc>
-        <w:tc>
-          <w:tcPr>
-            <w:tcW w:type="dxa" w:w="1488"/>
-          </w:tcPr>
-          <w:p>
-            <w:r>
-              <w:t>0.5685</w:t>
-            </w:r>
-          </w:p>
-        </w:tc>
-        <w:tc>
-          <w:tcPr>
-            <w:tcW w:type="dxa" w:w="1488"/>
-          </w:tcPr>
-          <w:p>
-            <w:r>
-              <w:t>0.9971</w:t>
-            </w:r>
-          </w:p>
-        </w:tc>
-        <w:tc>
-          <w:tcPr>
-            <w:tcW w:type="dxa" w:w="1488"/>
-          </w:tcPr>
-          <w:p>
-            <w:r>
-              <w:t>3.57e-05</w:t>
-            </w:r>
-          </w:p>
-        </w:tc>
-      </w:tr>
-      <w:tr>
-        <w:tc>
-          <w:tcPr>
-            <w:tcW w:type="dxa" w:w="1488"/>
-          </w:tcPr>
-          <w:p>
-            <w:r>
-              <w:t>nudge_0p1_plus</w:t>
-            </w:r>
-          </w:p>
-        </w:tc>
-        <w:tc>
-          <w:tcPr>
-            <w:tcW w:type="dxa" w:w="1488"/>
-          </w:tcPr>
-          <w:p>
-            <w:r>
-              <w:t>0.0750</w:t>
-            </w:r>
-          </w:p>
-        </w:tc>
-        <w:tc>
-          <w:tcPr>
-            <w:tcW w:type="dxa" w:w="1488"/>
-          </w:tcPr>
-          <w:p>
-            <w:r>
-              <w:t>0.1393</w:t>
-            </w:r>
-          </w:p>
-        </w:tc>
-        <w:tc>
-          <w:tcPr>
-            <w:tcW w:type="dxa" w:w="1488"/>
-          </w:tcPr>
-          <w:p>
-            <w:r>
-              <w:t>0.5468</w:t>
-            </w:r>
-          </w:p>
-        </w:tc>
-        <w:tc>
-          <w:tcPr>
-            <w:tcW w:type="dxa" w:w="1488"/>
-          </w:tcPr>
-          <w:p>
-            <w:r>
-              <w:t>0.9967</w:t>
-            </w:r>
-          </w:p>
-        </w:tc>
-        <w:tc>
-          <w:tcPr>
-            <w:tcW w:type="dxa" w:w="1488"/>
-          </w:tcPr>
-          <w:p>
-            <w:r>
-              <w:t>2.92e-05</w:t>
-            </w:r>
-          </w:p>
-        </w:tc>
-      </w:tr>
-      <w:tr>
-        <w:tc>
-          <w:tcPr>
-            <w:tcW w:type="dxa" w:w="1488"/>
-          </w:tcPr>
-          <w:p>
-            <w:r>
-              <w:t>nudge_0p01_plus</w:t>
-            </w:r>
-          </w:p>
-        </w:tc>
-        <w:tc>
-          <w:tcPr>
-            <w:tcW w:type="dxa" w:w="1488"/>
-          </w:tcPr>
-          <w:p>
-            <w:r>
-              <w:t>0.0711</w:t>
-            </w:r>
-          </w:p>
-        </w:tc>
-        <w:tc>
-          <w:tcPr>
-            <w:tcW w:type="dxa" w:w="1488"/>
-          </w:tcPr>
-          <w:p>
-            <w:r>
-              <w:t>0.0259</w:t>
-            </w:r>
-          </w:p>
-        </w:tc>
-        <w:tc>
-          <w:tcPr>
-            <w:tcW w:type="dxa" w:w="1488"/>
-          </w:tcPr>
-          <w:p>
-            <w:r>
-              <w:t>0.5064</w:t>
-            </w:r>
-          </w:p>
-        </w:tc>
-        <w:tc>
-          <w:tcPr>
-            <w:tcW w:type="dxa" w:w="1488"/>
-          </w:tcPr>
-          <w:p>
-            <w:r>
-              <w:t>0.9276</w:t>
-            </w:r>
-          </w:p>
-        </w:tc>
-        <w:tc>
-          <w:tcPr>
-            <w:tcW w:type="dxa" w:w="1488"/>
-          </w:tcPr>
-          <w:p>
-            <w:r>
-              <w:t>5.37e-06</w:t>
-            </w:r>
-          </w:p>
-        </w:tc>
-      </w:tr>
-      <w:tr>
-        <w:tc>
-          <w:tcPr>
-            <w:tcW w:type="dxa" w:w="1488"/>
-          </w:tcPr>
-          <w:p>
-            <w:r>
-              <w:t>nudge_0p01_plusminus</w:t>
-            </w:r>
-          </w:p>
-        </w:tc>
-        <w:tc>
-          <w:tcPr>
-            <w:tcW w:type="dxa" w:w="1488"/>
-          </w:tcPr>
-          <w:p>
-            <w:r>
-              <w:t>-0.1574</w:t>
-            </w:r>
-          </w:p>
-        </w:tc>
-        <w:tc>
-          <w:tcPr>
-            <w:tcW w:type="dxa" w:w="1488"/>
-          </w:tcPr>
-          <w:p>
-            <w:r>
-              <w:t>0.0013</w:t>
-            </w:r>
-          </w:p>
-        </w:tc>
-        <w:tc>
-          <w:tcPr>
-            <w:tcW w:type="dxa" w:w="1488"/>
-          </w:tcPr>
-          <w:p>
-            <w:r>
-              <w:t>0.4973</w:t>
-            </w:r>
-          </w:p>
-        </w:tc>
-        <w:tc>
-          <w:tcPr>
-            <w:tcW w:type="dxa" w:w="1488"/>
-          </w:tcPr>
-          <w:p>
-            <w:r>
-              <w:t>-0.8290</w:t>
-            </w:r>
-          </w:p>
-        </w:tc>
-        <w:tc>
-          <w:tcPr>
-            <w:tcW w:type="dxa" w:w="1488"/>
-          </w:tcPr>
-          <w:p>
-            <w:r>
-              <w:t>-2.96e-07</w:t>
-            </w:r>
-          </w:p>
-        </w:tc>
-      </w:tr>
-    </w:tbl>
-    <w:p>
-      <w:pPr>
-        <w:jc w:val="center"/>
-      </w:pPr>
-      <w:r>
-        <w:t>表2.4  Dplus 机制诊断关键指标。结论是 Dplus 具有局部下降成分，但当前 residual-delta 构造不是 BP-like 更新方向；plusminus 应从主线中移除。</w:t>
-      </w:r>
-    </w:p>
-    <w:p>
-      <w:pPr>
-        <w:pStyle w:val="3"/>
-      </w:pPr>
-      <w:r>
-        <w:t>2.2.10 输入能量、输出监督与 CNNThreeQ 结构扩展</w:t>
-      </w:r>
-    </w:p>
-    <w:p>
-      <w:pPr/>
-      <w:r>
-        <w:t>MNIST 实验还显示，784 维输入重构项会影响 10 维分类监督，但简单删除输入项并不能解决问题。输入 residual weight 设为 0、1/784 或 1/28 会降低最终 accuracy，说明输入项既可能压制监督，也在维持可用表示。更合理的后续方向是 boundary-clamped input、per-layer normalized energy、CE/softmax 输出监督和保守学习率调度。</w:t>
+        <w:t>MNIST 实验还显示，784 维输入重构项会影响 10 维分类监督，但简单删除输入项并不能解决问题。输入 residual weight 设为 0、1/784 或 1/28 会降低最终 accuracy，说明输入项既可能压制监督，也在维持可用表示。相对而言，CE-style output nudge 是当前最明确的正向改动：在 10k/2k、30 epoch 设置下达到约 86.5% selected accuracy，并在 full-data restore-best 设置下接近 88.0%。</w:t>
       </w:r>
     </w:p>
     <w:p>
@@ -19823,7 +19544,7 @@
         <w:drawing>
           <wp:inline xmlns:a="http://schemas.openxmlformats.org/drawingml/2006/main" xmlns:pic="http://schemas.openxmlformats.org/drawingml/2006/picture">
             <wp:extent cx="5349240" cy="2371414"/>
-            <wp:docPr id="1667263016" name="Picture 1667263016"/>
+            <wp:docPr id="1667263014" name="Picture 1667263014"/>
             <wp:cNvGraphicFramePr>
               <a:graphicFrameLocks noChangeAspect="1"/>
             </wp:cNvGraphicFramePr>
@@ -19835,7 +19556,7 @@
                     <pic:cNvPicPr/>
                   </pic:nvPicPr>
                   <pic:blipFill>
-                    <a:blip r:embed="rId27"/>
+                    <a:blip r:embed="rId25"/>
                     <a:stretch>
                       <a:fillRect/>
                     </a:stretch>
@@ -19856,159 +19577,107 @@
     </w:p>
     <w:p>
       <w:pPr>
+        <w:pStyle w:val="a9"/>
         <w:jc w:val="center"/>
       </w:pPr>
       <w:r>
-        <w:t>图2.14  输入重构能量比例与分类 accuracy 的关系。</w:t>
+        <w:t>图2.12  输入重构能量比例与分类 accuracy 的关系。</w:t>
+      </w:r>
+    </w:p>
+    <w:p>
+      <w:pPr>
+        <w:pStyle w:val="10"/>
+      </w:pPr>
+      <w:r>
+        <w:rPr>
+          <w:rFonts w:hint="eastAsia"/>
+        </w:rPr>
+        <w:t>3  后期拟完成的研究工作及进度安排</w:t>
+      </w:r>
+    </w:p>
+    <w:p>
+      <w:pPr>
+        <w:ind w:firstLineChars="200" w:firstLine="480"/>
+      </w:pPr>
+      <w:r>
+        <w:t>就当前研究进展而言，</w:t>
+      </w:r>
+      <w:proofErr w:type="gramStart"/>
+      <w:r>
+        <w:t>原总体</w:t>
+      </w:r>
+      <w:proofErr w:type="gramEnd"/>
+      <w:r>
+        <w:t>时间安排保持不变，但后续工作重点将从</w:t>
+      </w:r>
+      <w:r>
+        <w:t>“</w:t>
+      </w:r>
+      <w:r>
+        <w:t>证明局部收敛</w:t>
+      </w:r>
+      <w:r>
+        <w:t>”</w:t>
+      </w:r>
+      <w:r>
+        <w:t>转向</w:t>
+      </w:r>
+      <w:r>
+        <w:t>“</w:t>
+      </w:r>
+      <w:r>
+        <w:t>提高训练有效性与结构可扩展性</w:t>
+      </w:r>
+      <w:r>
+        <w:t>”</w:t>
+      </w:r>
+      <w:r>
+        <w:t>。</w:t>
+      </w:r>
+    </w:p>
+    <w:p>
+      <w:pPr>
+        <w:ind w:firstLineChars="200" w:firstLine="480"/>
+      </w:pPr>
+      <w:r>
+        <w:t>具体计划调整如下：一是将 EPBase3Q 的 beta=1.0 与 weak_steps=5 扩展到更完整的 MNIST benchmark，并采用多 seed 与 best checkpoint 记录；二是在公共框架中逐项对齐 legacy hidden size、batch size、状态步数、epsilon、beta、alphas 和初始化，找出 small-budget 退化来源；三是继续推进 DThreeQ 的 CE/softmax 输出监督、boundary-clamped input、layer-normalized energy 与 conservative learning-rate schedule，目标是保住 full-data early-best 而不发生后期崩塌；四是保留 Dplus 机制诊断作为问题定位工具，但不把当前 residual-delta 结果作为主要性能结论，后续只在方向指标明显改善后再进入训练筛查。</w:t>
+      </w:r>
+    </w:p>
+    <w:p>
+      <w:pPr>
+        <w:ind w:firstLineChars="200" w:firstLine="480"/>
+        <w:rPr>
+          <w:rFonts w:hint="eastAsia"/>
+        </w:rPr>
+      </w:pPr>
+    </w:p>
+    <w:p>
+      <w:pPr>
+        <w:pStyle w:val="10"/>
+      </w:pPr>
+      <w:r>
+        <w:lastRenderedPageBreak/>
+        <w:t>4</w:t>
+      </w:r>
+      <w:r>
+        <w:rPr>
+          <w:rFonts w:hint="eastAsia"/>
+        </w:rPr>
+        <w:t xml:space="preserve">  存在的问题与困难</w:t>
+      </w:r>
+    </w:p>
+    <w:p>
+      <w:pPr>
+        <w:ind w:firstLineChars="200" w:firstLine="480"/>
+      </w:pPr>
+      <w:r>
+        <w:t>目前的主要困难已经不再是局部 inference 稳定性的证明，而是“推断能够稳定收敛，但训练性能、表达能力和跨层 credit assignment 仍然不足”的矛盾。理论上，谱半径条件可以保证局部状态推断稳定；但在实现层面，hard clipping、状态饱和、输入重构能量占比过高、局部平均预测和 detach 路径都会削弱监督信号向浅层传播。</w:t>
       </w:r>
     </w:p>
     <w:p>
       <w:pPr/>
       <w:r>
-        <w:t>CNNThreeQ/EPCNNThreeQ 使用卷积与反卷积作为双向局部预测，是严格转置共享结构的重要推广。当前 legacy two-moons 图能够说明结构可行性，但尚不能作为性能排名证据；后续应建立独立的 CNN suite，固定数据、seed、状态步数、学习率和能量粒度，记录 best/final error、state delta、rho 或替代谱指标、saturation 与 runtime。</w:t>
-      </w:r>
-    </w:p>
-    <w:p>
-      <w:pPr>
-        <w:jc w:val="center"/>
-      </w:pPr>
-      <w:r>
-        <w:drawing>
-          <wp:inline xmlns:a="http://schemas.openxmlformats.org/drawingml/2006/main" xmlns:pic="http://schemas.openxmlformats.org/drawingml/2006/picture">
-            <wp:extent cx="5349240" cy="4483758"/>
-            <wp:docPr id="1667263017" name="Picture 1667263017"/>
-            <wp:cNvGraphicFramePr>
-              <a:graphicFrameLocks noChangeAspect="1"/>
-            </wp:cNvGraphicFramePr>
-            <a:graphic>
-              <a:graphicData uri="http://schemas.openxmlformats.org/drawingml/2006/picture">
-                <pic:pic>
-                  <pic:nvPicPr>
-                    <pic:cNvPr id="0" name="fig11_legacy_cnn_decision_boundaries.png"/>
-                    <pic:cNvPicPr/>
-                  </pic:nvPicPr>
-                  <pic:blipFill>
-                    <a:blip r:embed="rId28"/>
-                    <a:stretch>
-                      <a:fillRect/>
-                    </a:stretch>
-                  </pic:blipFill>
-                  <pic:spPr>
-                    <a:xfrm>
-                      <a:off x="0" y="0"/>
-                      <a:ext cx="5349240" cy="4483758"/>
-                    </a:xfrm>
-                    <a:prstGeom prst="rect"/>
-                  </pic:spPr>
-                </pic:pic>
-              </a:graphicData>
-            </a:graphic>
-          </wp:inline>
-        </w:drawing>
-      </w:r>
-    </w:p>
-    <w:p>
-      <w:pPr>
-        <w:jc w:val="center"/>
-      </w:pPr>
-      <w:r>
-        <w:t>图2.15  CNNThreeQ/EPCNNThreeQ 的 legacy two-moons decision-boundary 结构探索。</w:t>
-      </w:r>
-    </w:p>
-    <w:p>
-      <w:pPr>
-        <w:pStyle w:val="10"/>
-      </w:pPr>
-      <w:r>
-        <w:rPr>
-          <w:rFonts w:hint="eastAsia"/>
-        </w:rPr>
-        <w:t>3  后期拟完成的研究工作及进度安排</w:t>
-      </w:r>
-    </w:p>
-    <w:p>
-      <w:pPr>
-        <w:ind w:firstLineChars="200" w:firstLine="480"/>
-      </w:pPr>
-      <w:r>
-        <w:t>就当前研究进展而言，</w:t>
-      </w:r>
-      <w:proofErr w:type="gramStart"/>
-      <w:r>
-        <w:t>原总体</w:t>
-      </w:r>
-      <w:proofErr w:type="gramEnd"/>
-      <w:r>
-        <w:t>时间安排保持不变，但后续工作重点将从</w:t>
-      </w:r>
-      <w:r>
-        <w:t>“</w:t>
-      </w:r>
-      <w:r>
-        <w:t>证明局部收敛</w:t>
-      </w:r>
-      <w:r>
-        <w:t>”</w:t>
-      </w:r>
-      <w:r>
-        <w:t>转向</w:t>
-      </w:r>
-      <w:r>
-        <w:t>“</w:t>
-      </w:r>
-      <w:r>
-        <w:t>提高训练有效性与结构可扩展性</w:t>
-      </w:r>
-      <w:r>
-        <w:t>”</w:t>
-      </w:r>
-      <w:r>
-        <w:t>。</w:t>
-      </w:r>
-    </w:p>
-    <w:p>
-      <w:pPr>
-        <w:ind w:firstLineChars="200" w:firstLine="480"/>
-      </w:pPr>
-      <w:r>
-        <w:t>具体计划调整如下：一是将 EPBase3Q 的 beta=1.0 与 weak_steps=5 扩展到更完整的 MNIST benchmark，并采用多 seed 与 best checkpoint 记录；二是在公共框架中逐项对齐 legacy hidden size、batch size、状态步数、epsilon、beta、alphas 和初始化，找出 small-budget 退化来源；三是继续推进 DThreeQ 的 CE/softmax 输出监督、boundary-clamped input、layer-normalized energy 与 conservative learning-rate schedule，目标是保住 full-data early-best 而不发生后期崩塌；四是重新设计 Dplus residual target，优先尝试 signed residual target、output-to-hidden residual injection 和带约束的 layer-wise gain，并以 BP cosine、sign agreement 和 one-step CE decrease 作为机制筛选门槛；五是建立 CNNThreeQ 独立实验套件，检验卷积/反卷积对称结构在更一般任务上的有效性。</w:t>
-      </w:r>
-    </w:p>
-    <w:p>
-      <w:pPr>
-        <w:ind w:firstLineChars="200" w:firstLine="480"/>
-        <w:rPr>
-          <w:rFonts w:hint="eastAsia"/>
-        </w:rPr>
-      </w:pPr>
-    </w:p>
-    <w:p>
-      <w:pPr>
-        <w:pStyle w:val="10"/>
-      </w:pPr>
-      <w:r>
-        <w:lastRenderedPageBreak/>
-        <w:t>4</w:t>
-      </w:r>
-      <w:r>
-        <w:rPr>
-          <w:rFonts w:hint="eastAsia"/>
-        </w:rPr>
-        <w:t xml:space="preserve">  存在的问题与困难</w:t>
-      </w:r>
-    </w:p>
-    <w:p>
-      <w:pPr>
-        <w:ind w:firstLineChars="200" w:firstLine="480"/>
-      </w:pPr>
-      <w:r>
-        <w:t>目前的主要困难已经不再是局部 inference 稳定性的证明，而是“推断能够稳定收敛，但训练性能、表达能力和跨层 credit assignment 仍然不足”的矛盾。理论上，谱半径条件可以保证局部状态推断稳定；但在实现层面，hard clipping、状态饱和、输入重构能量占比过高、局部平均预测和 detach 路径都会削弱监督信号向浅层传播。</w:t>
-      </w:r>
-    </w:p>
-    <w:p>
-      <w:pPr/>
-      <w:r>
-        <w:t>具体而言，第一，Dplus 当前与 BP 更新方向不对齐，direct_plus 的 BP cosine 约为 0.076，plusminus 还会产生符号抵消；第二，EPThreeQ 虽然比 direct ThreeQ 稳定，但仍存在 early-best 后性能回退和训练成本较高的问题；第三，DThreeQ full-data restore-best 已接近 88.0% accuracy，但 final accuracy 会回退到约 83.8%，说明需要额外的状态稳定化与学习率调度；第四，CNNThreeQ 的卷积/反卷积对称结构尚缺少严格可比较实验，不能仅凭 legacy decision-boundary 图下结论。</w:t>
+        <w:t>具体而言，第一，EPThreeQ 虽然比 direct ThreeQ 稳定，但仍存在 early-best 后性能回退和训练成本较高的问题；第二，DThreeQ full-data restore-best 已接近 88.0% accuracy，但 final accuracy 会回退到约 83.8%，说明需要额外的状态稳定化与学习率调度；第三，Dplus 当前与 BP 更新方向仍不对齐，因此在中期报告中只作为机制问题和后续优化方向简要说明，不作为主要实验成果展开。</w:t>
       </w:r>
     </w:p>
     <w:p>

</xml_diff>

<commit_message>
Formalize midterm terminology and shorten difficulties
</commit_message>
<xml_diff>
--- a/paper_assets/reports/中期报告_完善版.docx
+++ b/paper_assets/reports/中期报告_完善版.docx
@@ -2168,7 +2168,7 @@
         <w:spacing w:line="300" w:lineRule="auto"/>
         <w:ind w:firstLine="420"/>
         <w:rPr>
-          <w:rFonts w:ascii="Times New Roman" w:eastAsia="宋体" w:hAnsi="Times New Roman" w:cs="Times New Roman" w:hint="eastAsia"/>
+          <w:rFonts w:ascii="Times New Roman" w:eastAsia="宋体" w:hAnsi="Times New Roman" w:cs="Times New Roman"/>
           <w:lang w:eastAsia="zh-CN"/>
         </w:rPr>
       </w:pPr>
@@ -2199,7 +2199,7 @@
         <w:pStyle w:val="FirstParagraph"/>
         <w:spacing w:line="300" w:lineRule="auto"/>
         <w:rPr>
-          <w:rFonts w:ascii="Cambria Math" w:eastAsia="宋体" w:hAnsi="Cambria Math" w:cs="Times New Roman" w:hint="eastAsia"/>
+          <w:rFonts w:ascii="Cambria Math" w:eastAsia="宋体" w:hAnsi="Cambria Math" w:cs="Times New Roman"/>
           <w:lang w:eastAsia="zh-CN"/>
           <w:oMath/>
         </w:rPr>
@@ -2448,190 +2448,12 @@
         <w:spacing w:line="300" w:lineRule="auto"/>
         <w:ind w:firstLine="420"/>
         <w:rPr>
-          <w:rFonts w:ascii="Times New Roman" w:eastAsia="宋体" w:hAnsi="Times New Roman" w:cs="Times New Roman" w:hint="eastAsia"/>
-          <w:lang w:eastAsia="zh-CN"/>
-        </w:rPr>
-      </w:pPr>
-      <w:r>
-        <w:rPr>
-          <w:rFonts w:ascii="Times New Roman" w:eastAsia="宋体" w:hAnsi="Times New Roman" w:cs="Times New Roman" w:hint="eastAsia"/>
-          <w:lang w:eastAsia="zh-CN"/>
-        </w:rPr>
-        <w:t>该规则比</w:t>
-      </w:r>
-      <w:r>
-        <w:rPr>
-          <w:rFonts w:ascii="Times New Roman" w:eastAsia="宋体" w:hAnsi="Times New Roman" w:cs="Times New Roman" w:hint="eastAsia"/>
-          <w:lang w:eastAsia="zh-CN"/>
-        </w:rPr>
-        <w:t xml:space="preserve"> direct total-energy objective </w:t>
-      </w:r>
-      <w:r>
-        <w:rPr>
-          <w:rFonts w:ascii="Times New Roman" w:eastAsia="宋体" w:hAnsi="Times New Roman" w:cs="Times New Roman" w:hint="eastAsia"/>
-          <w:lang w:eastAsia="zh-CN"/>
-        </w:rPr>
-        <w:t>更接近</w:t>
-      </w:r>
-      <w:r>
-        <w:rPr>
-          <w:rFonts w:ascii="Times New Roman" w:eastAsia="宋体" w:hAnsi="Times New Roman" w:cs="Times New Roman" w:hint="eastAsia"/>
-          <w:lang w:eastAsia="zh-CN"/>
-        </w:rPr>
-        <w:t xml:space="preserve"> Equilibrium Propagation </w:t>
-      </w:r>
-      <w:r>
-        <w:rPr>
-          <w:rFonts w:ascii="Times New Roman" w:eastAsia="宋体" w:hAnsi="Times New Roman" w:cs="Times New Roman" w:hint="eastAsia"/>
-          <w:lang w:eastAsia="zh-CN"/>
-        </w:rPr>
-        <w:t>的局部学习思想。实验上，</w:t>
-      </w:r>
-      <w:proofErr w:type="spellStart"/>
-      <w:r>
-        <w:rPr>
-          <w:rFonts w:ascii="Times New Roman" w:eastAsia="宋体" w:hAnsi="Times New Roman" w:cs="Times New Roman" w:hint="eastAsia"/>
-          <w:lang w:eastAsia="zh-CN"/>
-        </w:rPr>
-        <w:t>EPThreeQ</w:t>
-      </w:r>
-      <w:proofErr w:type="spellEnd"/>
-      <w:r>
-        <w:rPr>
-          <w:rFonts w:ascii="Times New Roman" w:eastAsia="宋体" w:hAnsi="Times New Roman" w:cs="Times New Roman" w:hint="eastAsia"/>
-          <w:lang w:eastAsia="zh-CN"/>
-        </w:rPr>
-        <w:t xml:space="preserve"> </w:t>
-      </w:r>
-      <w:r>
-        <w:rPr>
-          <w:rFonts w:ascii="Times New Roman" w:eastAsia="宋体" w:hAnsi="Times New Roman" w:cs="Times New Roman" w:hint="eastAsia"/>
-          <w:lang w:eastAsia="zh-CN"/>
-        </w:rPr>
-        <w:t>在</w:t>
-      </w:r>
-      <w:r>
-        <w:rPr>
-          <w:rFonts w:ascii="Times New Roman" w:eastAsia="宋体" w:hAnsi="Times New Roman" w:cs="Times New Roman" w:hint="eastAsia"/>
-          <w:lang w:eastAsia="zh-CN"/>
-        </w:rPr>
-        <w:t xml:space="preserve"> two moons minimal suite </w:t>
-      </w:r>
-      <w:r>
-        <w:rPr>
-          <w:rFonts w:ascii="Times New Roman" w:eastAsia="宋体" w:hAnsi="Times New Roman" w:cs="Times New Roman" w:hint="eastAsia"/>
-          <w:lang w:eastAsia="zh-CN"/>
-        </w:rPr>
-        <w:t>和</w:t>
-      </w:r>
-      <w:r>
-        <w:rPr>
-          <w:rFonts w:ascii="Times New Roman" w:eastAsia="宋体" w:hAnsi="Times New Roman" w:cs="Times New Roman" w:hint="eastAsia"/>
-          <w:lang w:eastAsia="zh-CN"/>
-        </w:rPr>
-        <w:t xml:space="preserve"> legacy MNIST reproduction </w:t>
-      </w:r>
-      <w:r>
-        <w:rPr>
-          <w:rFonts w:ascii="Times New Roman" w:eastAsia="宋体" w:hAnsi="Times New Roman" w:cs="Times New Roman" w:hint="eastAsia"/>
-          <w:lang w:eastAsia="zh-CN"/>
-        </w:rPr>
-        <w:t>中都显著优于</w:t>
-      </w:r>
-      <w:r>
-        <w:rPr>
-          <w:rFonts w:ascii="Times New Roman" w:eastAsia="宋体" w:hAnsi="Times New Roman" w:cs="Times New Roman" w:hint="eastAsia"/>
-          <w:lang w:eastAsia="zh-CN"/>
-        </w:rPr>
-        <w:t xml:space="preserve"> direct </w:t>
-      </w:r>
-      <w:proofErr w:type="spellStart"/>
-      <w:r>
-        <w:rPr>
-          <w:rFonts w:ascii="Times New Roman" w:eastAsia="宋体" w:hAnsi="Times New Roman" w:cs="Times New Roman" w:hint="eastAsia"/>
-          <w:lang w:eastAsia="zh-CN"/>
-        </w:rPr>
-        <w:t>ThreeQ</w:t>
-      </w:r>
-      <w:proofErr w:type="spellEnd"/>
-      <w:r>
-        <w:rPr>
-          <w:rFonts w:ascii="Times New Roman" w:eastAsia="宋体" w:hAnsi="Times New Roman" w:cs="Times New Roman" w:hint="eastAsia"/>
-          <w:lang w:eastAsia="zh-CN"/>
-        </w:rPr>
-        <w:t>。它的主要</w:t>
-      </w:r>
-      <w:proofErr w:type="gramStart"/>
-      <w:r>
-        <w:rPr>
-          <w:rFonts w:ascii="Times New Roman" w:eastAsia="宋体" w:hAnsi="Times New Roman" w:cs="Times New Roman" w:hint="eastAsia"/>
-          <w:lang w:eastAsia="zh-CN"/>
-        </w:rPr>
-        <w:t>超参风险</w:t>
-      </w:r>
-      <w:proofErr w:type="gramEnd"/>
-      <w:r>
-        <w:rPr>
-          <w:rFonts w:ascii="Times New Roman" w:eastAsia="宋体" w:hAnsi="Times New Roman" w:cs="Times New Roman" w:hint="eastAsia"/>
-          <w:lang w:eastAsia="zh-CN"/>
-        </w:rPr>
-        <w:t>是</w:t>
-      </w:r>
-      <w:r>
-        <w:rPr>
-          <w:rFonts w:ascii="Times New Roman" w:eastAsia="宋体" w:hAnsi="Times New Roman" w:cs="Times New Roman" w:hint="eastAsia"/>
-          <w:lang w:eastAsia="zh-CN"/>
-        </w:rPr>
-        <w:t xml:space="preserve"> </w:t>
-      </w:r>
-      <w:r>
-        <w:rPr>
-          <w:rFonts w:ascii="Times New Roman" w:eastAsia="宋体" w:hAnsi="Times New Roman" w:cs="Times New Roman" w:hint="eastAsia"/>
-          <w:lang w:eastAsia="zh-CN"/>
-        </w:rPr>
-        <w:t>β</w:t>
-      </w:r>
-      <w:r>
-        <w:rPr>
-          <w:rFonts w:ascii="Times New Roman" w:eastAsia="宋体" w:hAnsi="Times New Roman" w:cs="Times New Roman" w:hint="eastAsia"/>
-          <w:lang w:eastAsia="zh-CN"/>
-        </w:rPr>
-        <w:t xml:space="preserve"> </w:t>
-      </w:r>
-      <w:r>
-        <w:rPr>
-          <w:rFonts w:ascii="Times New Roman" w:eastAsia="宋体" w:hAnsi="Times New Roman" w:cs="Times New Roman" w:hint="eastAsia"/>
-          <w:lang w:eastAsia="zh-CN"/>
-        </w:rPr>
-        <w:t>与</w:t>
-      </w:r>
-      <w:r>
-        <w:rPr>
-          <w:rFonts w:ascii="Times New Roman" w:eastAsia="宋体" w:hAnsi="Times New Roman" w:cs="Times New Roman" w:hint="eastAsia"/>
-          <w:lang w:eastAsia="zh-CN"/>
-        </w:rPr>
-        <w:t xml:space="preserve"> weak steps</w:t>
-      </w:r>
-      <w:r>
-        <w:rPr>
-          <w:rFonts w:ascii="Times New Roman" w:eastAsia="宋体" w:hAnsi="Times New Roman" w:cs="Times New Roman" w:hint="eastAsia"/>
-          <w:lang w:eastAsia="zh-CN"/>
-        </w:rPr>
-        <w:t>：扰动太弱时信号不足，扰动过强或步数过多时容易出现</w:t>
-      </w:r>
-      <w:r>
-        <w:rPr>
-          <w:rFonts w:ascii="Times New Roman" w:eastAsia="宋体" w:hAnsi="Times New Roman" w:cs="Times New Roman" w:hint="eastAsia"/>
-          <w:lang w:eastAsia="zh-CN"/>
-        </w:rPr>
-        <w:t xml:space="preserve"> early-best </w:t>
-      </w:r>
-      <w:r>
-        <w:rPr>
-          <w:rFonts w:ascii="Times New Roman" w:eastAsia="宋体" w:hAnsi="Times New Roman" w:cs="Times New Roman" w:hint="eastAsia"/>
-          <w:lang w:eastAsia="zh-CN"/>
-        </w:rPr>
-        <w:t>后回退。</w:t>
+          <w:rFonts w:ascii="Times New Roman" w:eastAsia="宋体" w:hAnsi="Times New Roman" w:cs="Times New Roman"/>
+          <w:lang w:eastAsia="zh-CN"/>
+        </w:rPr>
+      </w:pPr>
+      <w:r>
+        <w:t>该规则比 direct total-energy objective 更接近 Equilibrium Propagation 的局部学习思想。实验上，EP预测性树突网络 在 two moons minimal suite 和 legacy MNIST reproduction 中都显著优于 direct 训练的预测性树突网络。它的主要超参风险是 β 与 weak steps：扰动太弱时信号不足，扰动过强或步数过多时容易出现 early-best 后回退。</w:t>
       </w:r>
     </w:p>
     <w:p>
@@ -2640,7 +2462,7 @@
         <w:spacing w:line="300" w:lineRule="auto"/>
         <w:ind w:firstLine="420"/>
         <w:rPr>
-          <w:rFonts w:ascii="Times New Roman" w:eastAsia="宋体" w:hAnsi="Times New Roman" w:cs="Times New Roman" w:hint="eastAsia"/>
+          <w:rFonts w:ascii="Times New Roman" w:eastAsia="宋体" w:hAnsi="Times New Roman" w:cs="Times New Roman"/>
           <w:lang w:eastAsia="zh-CN"/>
         </w:rPr>
       </w:pPr>
@@ -2720,7 +2542,7 @@
         <w:pStyle w:val="FirstParagraph"/>
         <w:spacing w:line="300" w:lineRule="auto"/>
         <w:rPr>
-          <w:rFonts w:ascii="Cambria Math" w:eastAsia="宋体" w:hAnsi="Cambria Math" w:cs="Times New Roman" w:hint="eastAsia"/>
+          <w:rFonts w:ascii="Cambria Math" w:eastAsia="宋体" w:hAnsi="Cambria Math" w:cs="Times New Roman"/>
           <w:lang w:eastAsia="zh-CN"/>
           <w:oMath/>
         </w:rPr>
@@ -3728,78 +3550,7 @@
         </w:rPr>
       </w:pPr>
       <w:r>
-        <w:rPr>
-          <w:rFonts w:ascii="Times New Roman" w:eastAsia="宋体" w:hAnsi="Times New Roman" w:cs="Times New Roman" w:hint="eastAsia"/>
-          <w:lang w:eastAsia="zh-CN"/>
-        </w:rPr>
-        <w:t>在固定参数</w:t>
-      </w:r>
-      <w:r>
-        <w:rPr>
-          <w:rFonts w:ascii="Times New Roman" w:eastAsia="宋体" w:hAnsi="Times New Roman" w:cs="Times New Roman"/>
-          <w:lang w:eastAsia="zh-CN"/>
-        </w:rPr>
-        <w:t xml:space="preserve"> </w:t>
-      </w:r>
-      <m:oMath>
-        <m:r>
-          <w:rPr>
-            <w:rFonts w:ascii="Cambria Math" w:eastAsia="宋体" w:hAnsi="Cambria Math" w:cs="Times New Roman"/>
-            <w:lang w:eastAsia="zh-CN"/>
-          </w:rPr>
-          <m:t>W</m:t>
-        </m:r>
-      </m:oMath>
-      <w:r>
-        <w:rPr>
-          <w:rFonts w:ascii="Times New Roman" w:eastAsia="宋体" w:hAnsi="Times New Roman" w:cs="Times New Roman"/>
-          <w:lang w:eastAsia="zh-CN"/>
-        </w:rPr>
-        <w:t xml:space="preserve"> </w:t>
-      </w:r>
-      <w:r>
-        <w:rPr>
-          <w:rFonts w:ascii="Times New Roman" w:eastAsia="宋体" w:hAnsi="Times New Roman" w:cs="Times New Roman" w:hint="eastAsia"/>
-          <w:lang w:eastAsia="zh-CN"/>
-        </w:rPr>
-        <w:t>下，</w:t>
-      </w:r>
-      <w:proofErr w:type="spellStart"/>
-      <w:r>
-        <w:rPr>
-          <w:rFonts w:ascii="Times New Roman" w:eastAsia="宋体" w:hAnsi="Times New Roman" w:cs="Times New Roman" w:hint="eastAsia"/>
-          <w:lang w:eastAsia="zh-CN"/>
-        </w:rPr>
-        <w:t>ThreeQ</w:t>
-      </w:r>
-      <w:proofErr w:type="spellEnd"/>
-      <w:r>
-        <w:rPr>
-          <w:rFonts w:ascii="Times New Roman" w:eastAsia="宋体" w:hAnsi="Times New Roman" w:cs="Times New Roman"/>
-          <w:lang w:eastAsia="zh-CN"/>
-        </w:rPr>
-        <w:t xml:space="preserve"> </w:t>
-      </w:r>
-      <w:r>
-        <w:rPr>
-          <w:rFonts w:ascii="Times New Roman" w:eastAsia="宋体" w:hAnsi="Times New Roman" w:cs="Times New Roman" w:hint="eastAsia"/>
-          <w:lang w:eastAsia="zh-CN"/>
-        </w:rPr>
-        <w:t>的</w:t>
-      </w:r>
-      <w:r>
-        <w:rPr>
-          <w:rFonts w:ascii="Times New Roman" w:eastAsia="宋体" w:hAnsi="Times New Roman" w:cs="Times New Roman"/>
-          <w:lang w:eastAsia="zh-CN"/>
-        </w:rPr>
-        <w:t xml:space="preserve"> inference </w:t>
-      </w:r>
-      <w:r>
-        <w:rPr>
-          <w:rFonts w:ascii="Times New Roman" w:eastAsia="宋体" w:hAnsi="Times New Roman" w:cs="Times New Roman" w:hint="eastAsia"/>
-          <w:lang w:eastAsia="zh-CN"/>
-        </w:rPr>
-        <w:t>由连续时间动力学给出：</w:t>
+        <w:t>在固定参数  下，预测性树突网络 的 inference 由连续时间动力学给出：</w:t>
       </w:r>
     </w:p>
     <w:p>
@@ -4545,7 +4296,7 @@
           <w:numId w:val="7"/>
         </w:numPr>
         <w:rPr>
-          <w:rFonts w:ascii="Times New Roman" w:eastAsia="宋体" w:hAnsi="Times New Roman" w:cs="Times New Roman" w:hint="eastAsia"/>
+          <w:rFonts w:ascii="Times New Roman" w:eastAsia="宋体" w:hAnsi="Times New Roman" w:cs="Times New Roman"/>
           <w:lang w:eastAsia="zh-CN"/>
         </w:rPr>
       </w:pPr>
@@ -9729,13 +9480,7 @@
         <w:rPr>
           <w:rFonts w:hint="eastAsia"/>
         </w:rPr>
-        <w:t xml:space="preserve"> </w:t>
-      </w:r>
-      <w:r>
-        <w:rPr>
-          <w:rFonts w:hint="eastAsia"/>
-        </w:rPr>
-        <w:t>训练的收敛性与鲁棒性</w:t>
+        <w:t xml:space="preserve"> 训练的收敛性与鲁棒性</w:t>
       </w:r>
     </w:p>
     <w:p>
@@ -16065,8 +15810,14 @@
             <w:pPr>
               <w:spacing w:line="240" w:lineRule="auto"/>
               <w:jc w:val="center"/>
+              <w:rPr>
+                <w:rFonts w:ascii="Cambria Math" w:hAnsi="Cambria Math"/>
+              </w:rPr>
             </w:pPr>
             <w:r>
+              <w:rPr>
+                <w:rFonts w:ascii="Cambria Math" w:hAnsi="Cambria Math"/>
+              </w:rPr>
               <w:t>1.07e-05</w:t>
             </w:r>
           </w:p>
@@ -17732,95 +17483,14 @@
         </w:rPr>
       </w:pPr>
       <w:r>
-        <w:rPr>
-          <w:rFonts w:ascii="宋体" w:hAnsi="宋体" w:hint="eastAsia"/>
-          <w:sz w:val="21"/>
-          <w:szCs w:val="21"/>
-        </w:rPr>
-        <w:t>图</w:t>
-      </w:r>
-      <w:r>
-        <w:rPr>
-          <w:rFonts w:ascii="宋体" w:hAnsi="宋体" w:hint="eastAsia"/>
-          <w:sz w:val="21"/>
-          <w:szCs w:val="21"/>
-        </w:rPr>
-        <w:t>2.5</w:t>
-      </w:r>
-      <w:r>
-        <w:rPr>
-          <w:rFonts w:ascii="宋体" w:hAnsi="宋体" w:hint="eastAsia"/>
-          <w:sz w:val="21"/>
-          <w:szCs w:val="21"/>
-        </w:rPr>
-        <w:t xml:space="preserve"> MNIST 当前性能总</w:t>
-      </w:r>
-      <w:proofErr w:type="gramStart"/>
-      <w:r>
-        <w:rPr>
-          <w:rFonts w:ascii="宋体" w:hAnsi="宋体" w:hint="eastAsia"/>
-          <w:sz w:val="21"/>
-          <w:szCs w:val="21"/>
-        </w:rPr>
-        <w:t>览</w:t>
-      </w:r>
-      <w:proofErr w:type="gramEnd"/>
-      <w:r>
-        <w:rPr>
-          <w:rFonts w:ascii="宋体" w:hAnsi="宋体" w:hint="eastAsia"/>
-          <w:sz w:val="21"/>
-          <w:szCs w:val="21"/>
-        </w:rPr>
-        <w:t>。EP路线和</w:t>
-      </w:r>
-      <w:r>
-        <w:rPr>
-          <w:rFonts w:ascii="宋体" w:hAnsi="宋体"/>
-          <w:sz w:val="21"/>
-          <w:szCs w:val="21"/>
-        </w:rPr>
-        <w:t>Dynamic</w:t>
-      </w:r>
-      <w:r>
-        <w:rPr>
-          <w:rFonts w:ascii="宋体" w:hAnsi="宋体" w:hint="eastAsia"/>
-          <w:sz w:val="21"/>
-          <w:szCs w:val="21"/>
-        </w:rPr>
-        <w:t>路线明显优于</w:t>
-      </w:r>
-      <w:proofErr w:type="gramStart"/>
-      <w:r>
-        <w:rPr>
-          <w:rFonts w:ascii="宋体" w:hAnsi="宋体" w:hint="eastAsia"/>
-          <w:sz w:val="21"/>
-          <w:szCs w:val="21"/>
-        </w:rPr>
-        <w:t>小预算</w:t>
-      </w:r>
-      <w:proofErr w:type="gramEnd"/>
-      <w:r>
-        <w:rPr>
-          <w:rFonts w:ascii="宋体" w:hAnsi="宋体" w:hint="eastAsia"/>
-          <w:sz w:val="21"/>
-          <w:szCs w:val="21"/>
-        </w:rPr>
-        <w:t>公共</w:t>
-      </w:r>
-      <w:r>
-        <w:rPr>
-          <w:rFonts w:ascii="宋体" w:hAnsi="宋体" w:hint="eastAsia"/>
-          <w:sz w:val="21"/>
-          <w:szCs w:val="21"/>
-        </w:rPr>
-        <w:t>原始网络</w:t>
+        <w:t>图2.5 MNIST 当前性能总览。EP路线和动态预测性树突网络路线明显优于小预算公共预测性树突网络</w:t>
       </w:r>
     </w:p>
     <w:p>
       <w:pPr>
         <w:jc w:val="center"/>
         <w:rPr>
-          <w:rFonts w:ascii="宋体" w:hAnsi="宋体"/>
+          <w:rFonts w:ascii="宋体" w:hAnsi="宋体" w:hint="eastAsia"/>
           <w:sz w:val="21"/>
           <w:szCs w:val="21"/>
         </w:rPr>
@@ -17854,11 +17524,6 @@
       </w:r>
     </w:p>
     <w:p>
-      <w:pPr>
-        <w:rPr>
-          <w:rFonts w:hint="eastAsia"/>
-        </w:rPr>
-      </w:pPr>
       <w:r>
         <w:tab/>
       </w:r>
@@ -18145,7 +17810,7 @@
       <w:pPr>
         <w:jc w:val="center"/>
         <w:rPr>
-          <w:rFonts w:ascii="宋体" w:hAnsi="宋体"/>
+          <w:rFonts w:ascii="宋体" w:hAnsi="宋体" w:hint="eastAsia"/>
           <w:sz w:val="21"/>
           <w:szCs w:val="21"/>
         </w:rPr>
@@ -18212,26 +17877,18 @@
       <w:pPr>
         <w:jc w:val="center"/>
         <w:rPr>
-          <w:rFonts w:ascii="宋体" w:hAnsi="宋体"/>
-          <w:sz w:val="21"/>
-          <w:szCs w:val="21"/>
-        </w:rPr>
-      </w:pPr>
-      <w:r>
-        <w:rPr>
           <w:rFonts w:ascii="宋体" w:hAnsi="宋体" w:hint="eastAsia"/>
           <w:sz w:val="21"/>
           <w:szCs w:val="21"/>
         </w:rPr>
-        <w:t>图</w:t>
-      </w:r>
+      </w:pPr>
       <w:r>
         <w:rPr>
           <w:rFonts w:ascii="宋体" w:hAnsi="宋体" w:hint="eastAsia"/>
           <w:sz w:val="21"/>
           <w:szCs w:val="21"/>
         </w:rPr>
-        <w:t>2.6</w:t>
+        <w:t>图</w:t>
       </w:r>
       <w:r>
         <w:rPr>
@@ -18239,42 +17896,58 @@
           <w:sz w:val="21"/>
           <w:szCs w:val="21"/>
         </w:rPr>
-        <w:t xml:space="preserve"> </w:t>
-      </w:r>
-      <w:proofErr w:type="spellStart"/>
+        <w:t>2.</w:t>
+      </w:r>
       <w:r>
         <w:rPr>
           <w:rFonts w:ascii="宋体" w:hAnsi="宋体" w:hint="eastAsia"/>
           <w:sz w:val="21"/>
           <w:szCs w:val="21"/>
         </w:rPr>
-        <w:t>Dplus</w:t>
-      </w:r>
-      <w:proofErr w:type="spellEnd"/>
+        <w:t>6</w:t>
+      </w:r>
       <w:r>
         <w:rPr>
           <w:rFonts w:ascii="宋体" w:hAnsi="宋体" w:hint="eastAsia"/>
           <w:sz w:val="21"/>
           <w:szCs w:val="21"/>
         </w:rPr>
-        <w:t>、BP、EP 更新向量方向诊断</w:t>
-      </w:r>
-    </w:p>
-    <w:p>
-      <w:pPr>
-        <w:jc w:val="center"/>
+        <w:t xml:space="preserve"> </w:t>
+      </w:r>
+      <w:proofErr w:type="spellStart"/>
+      <w:r>
         <w:rPr>
           <w:rFonts w:ascii="宋体" w:hAnsi="宋体" w:hint="eastAsia"/>
           <w:sz w:val="21"/>
           <w:szCs w:val="21"/>
         </w:rPr>
-      </w:pPr>
+        <w:t>Dplus</w:t>
+      </w:r>
+      <w:proofErr w:type="spellEnd"/>
+      <w:r>
+        <w:rPr>
+          <w:rFonts w:ascii="宋体" w:hAnsi="宋体" w:hint="eastAsia"/>
+          <w:sz w:val="21"/>
+          <w:szCs w:val="21"/>
+        </w:rPr>
+        <w:t>、BP、EP 更新向量方向诊断</w:t>
+      </w:r>
     </w:p>
     <w:p>
       <w:pPr>
         <w:jc w:val="center"/>
         <w:rPr>
-          <w:rFonts w:ascii="宋体" w:hAnsi="宋体"/>
+          <w:rFonts w:ascii="宋体" w:hAnsi="宋体" w:hint="eastAsia"/>
+          <w:sz w:val="21"/>
+          <w:szCs w:val="21"/>
+        </w:rPr>
+      </w:pPr>
+    </w:p>
+    <w:p>
+      <w:pPr>
+        <w:jc w:val="center"/>
+        <w:rPr>
+          <w:rFonts w:ascii="宋体" w:hAnsi="宋体" w:hint="eastAsia"/>
           <w:sz w:val="21"/>
           <w:szCs w:val="21"/>
         </w:rPr>
@@ -18340,26 +18013,18 @@
       <w:pPr>
         <w:jc w:val="center"/>
         <w:rPr>
-          <w:rFonts w:ascii="宋体" w:hAnsi="宋体"/>
-          <w:sz w:val="21"/>
-          <w:szCs w:val="21"/>
-        </w:rPr>
-      </w:pPr>
-      <w:r>
-        <w:rPr>
           <w:rFonts w:ascii="宋体" w:hAnsi="宋体" w:hint="eastAsia"/>
           <w:sz w:val="21"/>
           <w:szCs w:val="21"/>
         </w:rPr>
-        <w:t>图</w:t>
-      </w:r>
+      </w:pPr>
       <w:r>
         <w:rPr>
           <w:rFonts w:ascii="宋体" w:hAnsi="宋体" w:hint="eastAsia"/>
           <w:sz w:val="21"/>
           <w:szCs w:val="21"/>
         </w:rPr>
-        <w:t>2.8</w:t>
+        <w:t>图</w:t>
       </w:r>
       <w:r>
         <w:rPr>
@@ -18367,25 +18032,23 @@
           <w:sz w:val="21"/>
           <w:szCs w:val="21"/>
         </w:rPr>
-        <w:t xml:space="preserve"> </w:t>
-      </w:r>
-      <w:proofErr w:type="spellStart"/>
+        <w:t>2.</w:t>
+      </w:r>
       <w:r>
         <w:rPr>
           <w:rFonts w:ascii="宋体" w:hAnsi="宋体" w:hint="eastAsia"/>
           <w:sz w:val="21"/>
           <w:szCs w:val="21"/>
         </w:rPr>
-        <w:t>Dplus</w:t>
-      </w:r>
-      <w:proofErr w:type="spellEnd"/>
+        <w:t>7</w:t>
+      </w:r>
       <w:r>
         <w:rPr>
           <w:rFonts w:ascii="宋体" w:hAnsi="宋体" w:hint="eastAsia"/>
           <w:sz w:val="21"/>
           <w:szCs w:val="21"/>
         </w:rPr>
-        <w:t xml:space="preserve"> one-step loss decrease 与 </w:t>
+        <w:t xml:space="preserve"> </w:t>
       </w:r>
       <w:proofErr w:type="spellStart"/>
       <w:r>
@@ -18394,7 +18057,7 @@
           <w:sz w:val="21"/>
           <w:szCs w:val="21"/>
         </w:rPr>
-        <w:t>plusminus</w:t>
+        <w:t>Dplus</w:t>
       </w:r>
       <w:proofErr w:type="spellEnd"/>
       <w:r>
@@ -18403,54 +18066,77 @@
           <w:sz w:val="21"/>
           <w:szCs w:val="21"/>
         </w:rPr>
-        <w:t xml:space="preserve"> 失败模式</w:t>
-      </w:r>
-    </w:p>
-    <w:p>
-      <w:pPr>
-        <w:jc w:val="center"/>
+        <w:t xml:space="preserve"> one-step loss decrease 与 </w:t>
+      </w:r>
+      <w:proofErr w:type="spellStart"/>
+      <w:r>
         <w:rPr>
           <w:rFonts w:ascii="宋体" w:hAnsi="宋体" w:hint="eastAsia"/>
           <w:sz w:val="21"/>
           <w:szCs w:val="21"/>
         </w:rPr>
-      </w:pPr>
+        <w:t>plusminus</w:t>
+      </w:r>
+      <w:proofErr w:type="spellEnd"/>
+      <w:r>
+        <w:rPr>
+          <w:rFonts w:ascii="宋体" w:hAnsi="宋体" w:hint="eastAsia"/>
+          <w:sz w:val="21"/>
+          <w:szCs w:val="21"/>
+        </w:rPr>
+        <w:t xml:space="preserve"> 失败模式</w:t>
+      </w:r>
     </w:p>
     <w:p>
       <w:pPr>
-        <w:pStyle w:val="3"/>
-      </w:pPr>
-      <w:r>
-        <w:t>2.2.7 基于现有实验结果的综合补充</w:t>
-      </w:r>
+        <w:jc w:val="center"/>
+        <w:rPr>
+          <w:rFonts w:ascii="宋体" w:hAnsi="宋体" w:hint="eastAsia"/>
+          <w:sz w:val="21"/>
+          <w:szCs w:val="21"/>
+        </w:rPr>
+      </w:pPr>
     </w:p>
     <w:p>
-      <w:pPr/>
-      <w:r>
-        <w:t>在原有理论推导与收敛性实验基础上，本阶段进一步整理了 ThreeQ、EPThreeQ 与 DThreeQ 的可比较实验结果。考虑到当前仍有若干实验路线尚不充分，报告正文重点放在理论闭环较清楚、实验效果相对较好的部分：inference 收敛性验证、EPThreeQ 的稳定提升，以及 DThreeQ 在 CE-style 输出监督和 full-data restore-best 设置下的性能改进。</w:t>
+      <w:pPr>
+        <w:pStyle w:val="3"/>
+        <w:spacing w:before="120"/>
+      </w:pPr>
+      <w:r>
+        <w:t>2.2.7 基于现有实验结果的综合补充</w:t>
       </w:r>
     </w:p>
     <w:p>
+      <w:r>
+        <w:t>在原有理论推导与收敛性实验基础上，本阶段进一步整理了 预测性树突网络、EP预测性树突网络与动态预测性树突网络的可比较实验结果。考虑到当前仍有若干实验路线尚不充分，报告正文重点放在理论闭环较清楚、实验效果相对较好的部分：inference 收敛性验证、EP预测性树突网络的稳定提升，以及 动态预测性树突网络 在 CE-style 输出监督和 full-data restore-best 设置下的性能改进。</w:t>
+      </w:r>
+    </w:p>
+    <w:p>
       <w:pPr>
         <w:jc w:val="center"/>
       </w:pPr>
       <w:r>
+        <w:rPr>
+          <w:noProof/>
+        </w:rPr>
+        <w:lastRenderedPageBreak/>
         <w:drawing>
-          <wp:inline xmlns:a="http://schemas.openxmlformats.org/drawingml/2006/main" xmlns:pic="http://schemas.openxmlformats.org/drawingml/2006/picture">
+          <wp:inline distT="0" distB="0" distL="0" distR="0" wp14:anchorId="2C727B1C" wp14:editId="3EE9AB47">
             <wp:extent cx="5349240" cy="2204280"/>
+            <wp:effectExtent l="0" t="0" r="0" b="0"/>
             <wp:docPr id="1667263011" name="Picture 1667263011"/>
             <wp:cNvGraphicFramePr>
-              <a:graphicFrameLocks noChangeAspect="1"/>
+              <a:graphicFrameLocks xmlns:a="http://schemas.openxmlformats.org/drawingml/2006/main" noChangeAspect="1"/>
             </wp:cNvGraphicFramePr>
-            <a:graphic>
+            <a:graphic xmlns:a="http://schemas.openxmlformats.org/drawingml/2006/main">
               <a:graphicData uri="http://schemas.openxmlformats.org/drawingml/2006/picture">
-                <pic:pic>
+                <pic:pic xmlns:pic="http://schemas.openxmlformats.org/drawingml/2006/picture">
                   <pic:nvPicPr>
                     <pic:cNvPr id="0" name="fig03_mnist_current_performance.png"/>
                     <pic:cNvPicPr/>
                   </pic:nvPicPr>
                   <pic:blipFill>
-                    <a:blip r:embed="rId22"/>
+                    <a:blip r:embed="rId16"/>
                     <a:stretch>
                       <a:fillRect/>
                     </a:stretch>
@@ -18460,7 +18146,9 @@
                       <a:off x="0" y="0"/>
                       <a:ext cx="5349240" cy="2204280"/>
                     </a:xfrm>
-                    <a:prstGeom prst="rect"/>
+                    <a:prstGeom prst="rect">
+                      <a:avLst/>
+                    </a:prstGeom>
                   </pic:spPr>
                 </pic:pic>
               </a:graphicData>
@@ -18472,53 +18160,116 @@
     <w:p>
       <w:pPr>
         <w:pStyle w:val="a9"/>
-        <w:jc w:val="center"/>
-      </w:pPr>
-      <w:r>
-        <w:t>图2.9  MNIST 当前性能总览：legacy EPThreeQ 与 DThreeQ CE/full-data 变体明显优于小预算公共 ThreeQ screen。</w:t>
+        <w:ind w:firstLine="420"/>
+        <w:rPr>
+          <w:lang w:eastAsia="zh-CN"/>
+        </w:rPr>
+      </w:pPr>
+      <w:r>
+        <w:t>图2.8  MNIST 当前性能总览：legacy EP预测性树突网络与动态预测性树突网络 CE/full-data 变体明显优于小预算公共 预测性树突网络 screen。</w:t>
+      </w:r>
+    </w:p>
+    <w:p>
+      <w:pPr>
+        <w:pStyle w:val="a9"/>
+        <w:ind w:firstLine="420"/>
+        <w:rPr>
+          <w:lang w:eastAsia="zh-CN"/>
+        </w:rPr>
+      </w:pPr>
+    </w:p>
+    <w:p>
+      <w:pPr>
+        <w:pStyle w:val="a9"/>
+        <w:ind w:firstLineChars="0" w:firstLine="0"/>
+        <w:rPr>
+          <w:rFonts w:hint="eastAsia"/>
+          <w:lang w:eastAsia="zh-CN"/>
+        </w:rPr>
+      </w:pPr>
+      <w:r>
+        <w:t>表2.2  关键性能实验结果汇总。该表区分了 legacy 复现实验、小预算 stress screen 和 动态预测性树突网络 full-data restore-best，因此不能把不同预算下的结果直接混为同一个 benchmark。</w:t>
       </w:r>
     </w:p>
     <w:tbl>
       <w:tblPr>
-        <w:tblW w:type="auto" w:w="0"/>
+        <w:tblW w:w="0" w:type="auto"/>
         <w:jc w:val="center"/>
-        <w:tblLayout w:type="autofit"/>
-        <w:tblLook w:firstColumn="1" w:firstRow="1" w:lastColumn="0" w:lastRow="0" w:noHBand="0" w:noVBand="1" w:val="04A0"/>
+        <w:tblBorders>
+          <w:top w:val="single" w:sz="4" w:space="0" w:color="auto"/>
+          <w:bottom w:val="single" w:sz="4" w:space="0" w:color="auto"/>
+        </w:tblBorders>
+        <w:tblLook w:val="0000" w:firstRow="0" w:lastRow="0" w:firstColumn="0" w:lastColumn="0" w:noHBand="0" w:noVBand="0"/>
       </w:tblPr>
       <w:tblGrid>
-        <w:gridCol w:w="2232"/>
-        <w:gridCol w:w="2232"/>
-        <w:gridCol w:w="2232"/>
-        <w:gridCol w:w="2232"/>
+        <w:gridCol w:w="2239"/>
+        <w:gridCol w:w="1972"/>
+        <w:gridCol w:w="1935"/>
+        <w:gridCol w:w="2924"/>
       </w:tblGrid>
       <w:tr>
+        <w:trPr>
+          <w:trHeight w:val="374"/>
+          <w:jc w:val="center"/>
+        </w:trPr>
         <w:tc>
           <w:tcPr>
-            <w:tcW w:type="dxa" w:w="2232"/>
+            <w:tcW w:w="0" w:type="auto"/>
+            <w:tcBorders>
+              <w:top w:val="single" w:sz="4" w:space="0" w:color="auto"/>
+              <w:bottom w:val="single" w:sz="4" w:space="0" w:color="auto"/>
+              <w:right w:val="nil"/>
+            </w:tcBorders>
           </w:tcPr>
           <w:p>
             <w:pPr>
+              <w:spacing w:line="240" w:lineRule="auto"/>
               <w:jc w:val="center"/>
+              <w:rPr>
+                <w:sz w:val="21"/>
+              </w:rPr>
             </w:pPr>
             <w:r>
               <w:rPr>
-                <w:b/>
-              </w:rPr>
-              <w:t>模型/实验</w:t>
+                <w:rFonts w:ascii="Cambria Math" w:hAnsi="Cambria Math"/>
+              </w:rPr>
+              <w:t>模型</w:t>
+            </w:r>
+            <w:r>
+              <w:rPr>
+                <w:rFonts w:ascii="Cambria Math" w:hAnsi="Cambria Math"/>
+              </w:rPr>
+              <w:t>/</w:t>
+            </w:r>
+            <w:r>
+              <w:rPr>
+                <w:rFonts w:ascii="Cambria Math" w:hAnsi="Cambria Math"/>
+              </w:rPr>
+              <w:t>实验</w:t>
             </w:r>
           </w:p>
         </w:tc>
         <w:tc>
           <w:tcPr>
-            <w:tcW w:type="dxa" w:w="2232"/>
+            <w:tcW w:w="0" w:type="auto"/>
+            <w:tcBorders>
+              <w:top w:val="single" w:sz="4" w:space="0" w:color="auto"/>
+              <w:left w:val="nil"/>
+              <w:bottom w:val="single" w:sz="4" w:space="0" w:color="auto"/>
+              <w:right w:val="nil"/>
+            </w:tcBorders>
           </w:tcPr>
           <w:p>
             <w:pPr>
+              <w:spacing w:line="240" w:lineRule="auto"/>
               <w:jc w:val="center"/>
+              <w:rPr>
+                <w:sz w:val="21"/>
+              </w:rPr>
             </w:pPr>
             <w:r>
               <w:rPr>
-                <w:b/>
+                <w:rFonts w:ascii="Cambria Math" w:hAnsi="Cambria Math"/>
               </w:rPr>
               <w:t>设置</w:t>
             </w:r>
@@ -18526,15 +18277,25 @@
         </w:tc>
         <w:tc>
           <w:tcPr>
-            <w:tcW w:type="dxa" w:w="2232"/>
+            <w:tcW w:w="0" w:type="auto"/>
+            <w:tcBorders>
+              <w:top w:val="single" w:sz="4" w:space="0" w:color="auto"/>
+              <w:left w:val="nil"/>
+              <w:bottom w:val="single" w:sz="4" w:space="0" w:color="auto"/>
+              <w:right w:val="nil"/>
+            </w:tcBorders>
           </w:tcPr>
           <w:p>
             <w:pPr>
+              <w:spacing w:line="240" w:lineRule="auto"/>
               <w:jc w:val="center"/>
+              <w:rPr>
+                <w:sz w:val="21"/>
+              </w:rPr>
             </w:pPr>
             <w:r>
               <w:rPr>
-                <w:b/>
+                <w:rFonts w:ascii="Cambria Math" w:hAnsi="Cambria Math"/>
               </w:rPr>
               <w:t>主要结果</w:t>
             </w:r>
@@ -18542,15 +18303,25 @@
         </w:tc>
         <w:tc>
           <w:tcPr>
-            <w:tcW w:type="dxa" w:w="2232"/>
+            <w:tcW w:w="0" w:type="auto"/>
+            <w:tcBorders>
+              <w:top w:val="single" w:sz="4" w:space="0" w:color="auto"/>
+              <w:left w:val="nil"/>
+              <w:bottom w:val="single" w:sz="4" w:space="0" w:color="auto"/>
+              <w:right w:val="nil"/>
+            </w:tcBorders>
           </w:tcPr>
           <w:p>
             <w:pPr>
+              <w:spacing w:line="240" w:lineRule="auto"/>
               <w:jc w:val="center"/>
+              <w:rPr>
+                <w:sz w:val="21"/>
+              </w:rPr>
             </w:pPr>
             <w:r>
               <w:rPr>
-                <w:b/>
+                <w:rFonts w:ascii="Cambria Math" w:hAnsi="Cambria Math"/>
               </w:rPr>
               <w:t>结论</w:t>
             </w:r>
@@ -18558,325 +18329,479 @@
         </w:tc>
       </w:tr>
       <w:tr>
+        <w:trPr>
+          <w:trHeight w:val="374"/>
+          <w:jc w:val="center"/>
+        </w:trPr>
         <w:tc>
           <w:tcPr>
-            <w:tcW w:type="dxa" w:w="2232"/>
+            <w:tcW w:w="0" w:type="auto"/>
           </w:tcPr>
           <w:p>
             <w:pPr>
+              <w:spacing w:line="240" w:lineRule="auto"/>
               <w:jc w:val="center"/>
+              <w:rPr>
+                <w:rFonts w:ascii="宋体" w:hAnsi="宋体" w:hint="eastAsia"/>
+                <w:sz w:val="21"/>
+              </w:rPr>
             </w:pPr>
             <w:r>
-              <w:t>Base3Q legacy</w:t>
+              <w:t>基础预测性树突网络 legacy</w:t>
             </w:r>
           </w:p>
         </w:tc>
         <w:tc>
           <w:tcPr>
-            <w:tcW w:type="dxa" w:w="2232"/>
+            <w:tcW w:w="0" w:type="auto"/>
           </w:tcPr>
           <w:p>
             <w:pPr>
+              <w:spacing w:line="240" w:lineRule="auto"/>
               <w:jc w:val="center"/>
+              <w:rPr>
+                <w:rFonts w:ascii="宋体" w:hAnsi="宋体" w:hint="eastAsia"/>
+                <w:sz w:val="21"/>
+              </w:rPr>
             </w:pPr>
             <w:r>
+              <w:rPr>
+                <w:rFonts w:ascii="Cambria Math" w:hAnsi="Cambria Math"/>
+              </w:rPr>
               <w:t>MNIST 5k/1k, 8 epoch</w:t>
             </w:r>
           </w:p>
         </w:tc>
         <w:tc>
           <w:tcPr>
-            <w:tcW w:type="dxa" w:w="2232"/>
+            <w:tcW w:w="0" w:type="auto"/>
           </w:tcPr>
           <w:p>
             <w:pPr>
+              <w:spacing w:line="240" w:lineRule="auto"/>
               <w:jc w:val="center"/>
+              <w:rPr>
+                <w:rFonts w:ascii="宋体" w:hAnsi="宋体" w:hint="eastAsia"/>
+                <w:sz w:val="21"/>
+              </w:rPr>
             </w:pPr>
             <w:r>
+              <w:rPr>
+                <w:rFonts w:ascii="Cambria Math" w:hAnsi="Cambria Math"/>
+              </w:rPr>
               <w:t>60.2% best valid accuracy</w:t>
             </w:r>
           </w:p>
         </w:tc>
         <w:tc>
           <w:tcPr>
-            <w:tcW w:type="dxa" w:w="2232"/>
+            <w:tcW w:w="0" w:type="auto"/>
           </w:tcPr>
           <w:p>
             <w:pPr>
+              <w:spacing w:line="240" w:lineRule="auto"/>
               <w:jc w:val="center"/>
+              <w:rPr>
+                <w:rFonts w:ascii="宋体" w:hAnsi="宋体" w:hint="eastAsia"/>
+                <w:sz w:val="21"/>
+              </w:rPr>
             </w:pPr>
             <w:r>
-              <w:t>原始 ThreeQ 可学习但收敛较慢</w:t>
+              <w:t>原始预测性树突网络可学习但收敛较慢</w:t>
             </w:r>
           </w:p>
         </w:tc>
       </w:tr>
       <w:tr>
+        <w:trPr>
+          <w:trHeight w:val="374"/>
+          <w:jc w:val="center"/>
+        </w:trPr>
         <w:tc>
           <w:tcPr>
-            <w:tcW w:type="dxa" w:w="2232"/>
+            <w:tcW w:w="0" w:type="auto"/>
           </w:tcPr>
           <w:p>
             <w:pPr>
+              <w:spacing w:line="240" w:lineRule="auto"/>
               <w:jc w:val="center"/>
             </w:pPr>
             <w:r>
-              <w:t>EPBase3Q legacy</w:t>
+              <w:t>EP预测性树突网络 legacy</w:t>
             </w:r>
           </w:p>
         </w:tc>
         <w:tc>
           <w:tcPr>
-            <w:tcW w:type="dxa" w:w="2232"/>
+            <w:tcW w:w="0" w:type="auto"/>
           </w:tcPr>
           <w:p>
             <w:pPr>
+              <w:spacing w:line="240" w:lineRule="auto"/>
               <w:jc w:val="center"/>
             </w:pPr>
             <w:r>
+              <w:rPr>
+                <w:rFonts w:ascii="Cambria Math" w:hAnsi="Cambria Math"/>
+              </w:rPr>
               <w:t>MNIST 5k/1k, 8 epoch</w:t>
             </w:r>
           </w:p>
         </w:tc>
         <w:tc>
           <w:tcPr>
-            <w:tcW w:type="dxa" w:w="2232"/>
+            <w:tcW w:w="0" w:type="auto"/>
           </w:tcPr>
           <w:p>
             <w:pPr>
+              <w:spacing w:line="240" w:lineRule="auto"/>
               <w:jc w:val="center"/>
             </w:pPr>
             <w:r>
+              <w:rPr>
+                <w:rFonts w:ascii="Cambria Math" w:hAnsi="Cambria Math"/>
+              </w:rPr>
               <w:t>77.5% best valid accuracy</w:t>
             </w:r>
           </w:p>
         </w:tc>
         <w:tc>
           <w:tcPr>
-            <w:tcW w:type="dxa" w:w="2232"/>
+            <w:tcW w:w="0" w:type="auto"/>
           </w:tcPr>
           <w:p>
             <w:pPr>
+              <w:spacing w:line="240" w:lineRule="auto"/>
               <w:jc w:val="center"/>
             </w:pPr>
             <w:r>
-              <w:t>EP 明显优于 direct</w:t>
+              <w:t>EP训练明显优于直接训练</w:t>
             </w:r>
           </w:p>
         </w:tc>
       </w:tr>
       <w:tr>
+        <w:trPr>
+          <w:trHeight w:val="374"/>
+          <w:jc w:val="center"/>
+        </w:trPr>
         <w:tc>
           <w:tcPr>
-            <w:tcW w:type="dxa" w:w="2232"/>
+            <w:tcW w:w="0" w:type="auto"/>
           </w:tcPr>
           <w:p>
             <w:pPr>
+              <w:spacing w:line="240" w:lineRule="auto"/>
               <w:jc w:val="center"/>
             </w:pPr>
             <w:r>
-              <w:t>EPBase3Q tune</w:t>
+              <w:t>EP预测性树突网络 tune</w:t>
             </w:r>
           </w:p>
         </w:tc>
         <w:tc>
           <w:tcPr>
-            <w:tcW w:type="dxa" w:w="2232"/>
+            <w:tcW w:w="0" w:type="auto"/>
           </w:tcPr>
           <w:p>
             <w:pPr>
+              <w:spacing w:line="240" w:lineRule="auto"/>
               <w:jc w:val="center"/>
             </w:pPr>
             <w:r>
+              <w:rPr>
+                <w:rFonts w:ascii="Cambria Math" w:hAnsi="Cambria Math"/>
+              </w:rPr>
               <w:t>MNIST 10k/2k, 15 epoch</w:t>
             </w:r>
           </w:p>
         </w:tc>
         <w:tc>
           <w:tcPr>
-            <w:tcW w:type="dxa" w:w="2232"/>
+            <w:tcW w:w="0" w:type="auto"/>
           </w:tcPr>
           <w:p>
             <w:pPr>
+              <w:spacing w:line="240" w:lineRule="auto"/>
               <w:jc w:val="center"/>
             </w:pPr>
             <w:r>
+              <w:rPr>
+                <w:rFonts w:ascii="Cambria Math" w:hAnsi="Cambria Math"/>
+              </w:rPr>
               <w:t>86.5% best valid accuracy</w:t>
             </w:r>
           </w:p>
         </w:tc>
         <w:tc>
           <w:tcPr>
-            <w:tcW w:type="dxa" w:w="2232"/>
+            <w:tcW w:w="0" w:type="auto"/>
           </w:tcPr>
           <w:p>
             <w:pPr>
+              <w:spacing w:line="240" w:lineRule="auto"/>
               <w:jc w:val="center"/>
             </w:pPr>
             <w:r>
-              <w:t>当前最稳的原始 ThreeQ 改进线</w:t>
+              <w:t>当前最稳的预测性树突网络改进路线</w:t>
             </w:r>
           </w:p>
         </w:tc>
       </w:tr>
       <w:tr>
+        <w:trPr>
+          <w:trHeight w:val="374"/>
+          <w:jc w:val="center"/>
+        </w:trPr>
         <w:tc>
           <w:tcPr>
-            <w:tcW w:type="dxa" w:w="2232"/>
+            <w:tcW w:w="0" w:type="auto"/>
           </w:tcPr>
           <w:p>
             <w:pPr>
+              <w:spacing w:line="240" w:lineRule="auto"/>
               <w:jc w:val="center"/>
             </w:pPr>
             <w:r>
-              <w:t>DThreeQ EP-nudge</w:t>
+              <w:t>动态预测性树突网络 EP-nudge</w:t>
             </w:r>
           </w:p>
         </w:tc>
         <w:tc>
           <w:tcPr>
-            <w:tcW w:type="dxa" w:w="2232"/>
+            <w:tcW w:w="0" w:type="auto"/>
           </w:tcPr>
           <w:p>
             <w:pPr>
+              <w:spacing w:line="240" w:lineRule="auto"/>
               <w:jc w:val="center"/>
             </w:pPr>
             <w:r>
+              <w:rPr>
+                <w:rFonts w:ascii="Cambria Math" w:hAnsi="Cambria Math"/>
+              </w:rPr>
               <w:t>MNIST 10k/2k, 30 epoch</w:t>
             </w:r>
           </w:p>
         </w:tc>
         <w:tc>
           <w:tcPr>
-            <w:tcW w:type="dxa" w:w="2232"/>
+            <w:tcW w:w="0" w:type="auto"/>
           </w:tcPr>
           <w:p>
             <w:pPr>
+              <w:spacing w:line="240" w:lineRule="auto"/>
               <w:jc w:val="center"/>
             </w:pPr>
             <w:r>
+              <w:rPr>
+                <w:rFonts w:ascii="Cambria Math" w:hAnsi="Cambria Math"/>
+              </w:rPr>
               <w:t>83.9% best accuracy</w:t>
             </w:r>
           </w:p>
         </w:tc>
         <w:tc>
           <w:tcPr>
-            <w:tcW w:type="dxa" w:w="2232"/>
+            <w:tcW w:w="0" w:type="auto"/>
           </w:tcPr>
           <w:p>
             <w:pPr>
+              <w:spacing w:line="240" w:lineRule="auto"/>
               <w:jc w:val="center"/>
             </w:pPr>
             <w:r>
-              <w:t>DThreeQ 可学习，但仍低于 EPThreeQ tune</w:t>
+              <w:t>动态预测性树突网络 可学习，但仍低于 EP预测性树突网络 tune</w:t>
             </w:r>
           </w:p>
         </w:tc>
       </w:tr>
       <w:tr>
+        <w:trPr>
+          <w:trHeight w:val="374"/>
+          <w:jc w:val="center"/>
+        </w:trPr>
         <w:tc>
           <w:tcPr>
-            <w:tcW w:type="dxa" w:w="2232"/>
+            <w:tcW w:w="0" w:type="auto"/>
           </w:tcPr>
           <w:p>
             <w:pPr>
+              <w:spacing w:line="240" w:lineRule="auto"/>
               <w:jc w:val="center"/>
             </w:pPr>
             <w:r>
-              <w:t>DThreeQ CE-nudge</w:t>
+              <w:t>动态预测性树突网络 CE-nudge</w:t>
             </w:r>
           </w:p>
         </w:tc>
         <w:tc>
           <w:tcPr>
-            <w:tcW w:type="dxa" w:w="2232"/>
+            <w:tcW w:w="0" w:type="auto"/>
           </w:tcPr>
           <w:p>
             <w:pPr>
+              <w:spacing w:line="240" w:lineRule="auto"/>
               <w:jc w:val="center"/>
             </w:pPr>
             <w:r>
+              <w:rPr>
+                <w:rFonts w:ascii="Cambria Math" w:hAnsi="Cambria Math"/>
+              </w:rPr>
               <w:t>MNIST 10k/2k, 30 epoch</w:t>
             </w:r>
           </w:p>
         </w:tc>
         <w:tc>
           <w:tcPr>
-            <w:tcW w:type="dxa" w:w="2232"/>
+            <w:tcW w:w="0" w:type="auto"/>
           </w:tcPr>
           <w:p>
             <w:pPr>
+              <w:spacing w:line="240" w:lineRule="auto"/>
               <w:jc w:val="center"/>
             </w:pPr>
             <w:r>
+              <w:rPr>
+                <w:rFonts w:ascii="Cambria Math" w:hAnsi="Cambria Math"/>
+              </w:rPr>
               <w:t>86.5% selected accuracy</w:t>
             </w:r>
           </w:p>
         </w:tc>
         <w:tc>
           <w:tcPr>
-            <w:tcW w:type="dxa" w:w="2232"/>
+            <w:tcW w:w="0" w:type="auto"/>
           </w:tcPr>
           <w:p>
             <w:pPr>
+              <w:spacing w:line="240" w:lineRule="auto"/>
               <w:jc w:val="center"/>
             </w:pPr>
             <w:r>
-              <w:t>CE-style 输出监督是明确正向改动</w:t>
+              <w:rPr>
+                <w:rFonts w:ascii="Cambria Math" w:hAnsi="Cambria Math"/>
+              </w:rPr>
+              <w:t xml:space="preserve">CE-style </w:t>
+            </w:r>
+            <w:r>
+              <w:rPr>
+                <w:rFonts w:ascii="Cambria Math" w:hAnsi="Cambria Math"/>
+              </w:rPr>
+              <w:t>输出监督是明确正向改动</w:t>
             </w:r>
           </w:p>
         </w:tc>
       </w:tr>
       <w:tr>
+        <w:trPr>
+          <w:trHeight w:val="374"/>
+          <w:jc w:val="center"/>
+        </w:trPr>
         <w:tc>
           <w:tcPr>
-            <w:tcW w:type="dxa" w:w="2232"/>
+            <w:tcW w:w="0" w:type="auto"/>
           </w:tcPr>
           <w:p>
             <w:pPr>
+              <w:spacing w:line="240" w:lineRule="auto"/>
               <w:jc w:val="center"/>
+              <w:rPr>
+                <w:rFonts w:ascii="Cambria Math" w:hAnsi="Cambria Math"/>
+              </w:rPr>
             </w:pPr>
             <w:r>
-              <w:t>DThreeQ full-data restore-best</w:t>
+              <w:t>动态预测性树突网络 full-data restore-best</w:t>
             </w:r>
           </w:p>
         </w:tc>
         <w:tc>
           <w:tcPr>
-            <w:tcW w:type="dxa" w:w="2232"/>
+            <w:tcW w:w="0" w:type="auto"/>
           </w:tcPr>
           <w:p>
             <w:pPr>
+              <w:spacing w:line="240" w:lineRule="auto"/>
               <w:jc w:val="center"/>
+              <w:rPr>
+                <w:rFonts w:ascii="Cambria Math" w:hAnsi="Cambria Math"/>
+              </w:rPr>
             </w:pPr>
             <w:r>
+              <w:rPr>
+                <w:rFonts w:ascii="Cambria Math" w:hAnsi="Cambria Math"/>
+              </w:rPr>
               <w:t>MNIST 60k/10k, 30 epoch</w:t>
             </w:r>
           </w:p>
         </w:tc>
         <w:tc>
           <w:tcPr>
-            <w:tcW w:type="dxa" w:w="2232"/>
+            <w:tcW w:w="0" w:type="auto"/>
           </w:tcPr>
           <w:p>
             <w:pPr>
+              <w:spacing w:line="240" w:lineRule="auto"/>
               <w:jc w:val="center"/>
+              <w:rPr>
+                <w:rFonts w:ascii="Cambria Math" w:hAnsi="Cambria Math"/>
+              </w:rPr>
             </w:pPr>
             <w:r>
+              <w:rPr>
+                <w:rFonts w:ascii="Cambria Math" w:hAnsi="Cambria Math"/>
+              </w:rPr>
               <w:t>88.0% selected accuracy</w:t>
             </w:r>
           </w:p>
         </w:tc>
         <w:tc>
           <w:tcPr>
-            <w:tcW w:type="dxa" w:w="2232"/>
+            <w:tcW w:w="0" w:type="auto"/>
           </w:tcPr>
           <w:p>
             <w:pPr>
+              <w:spacing w:line="240" w:lineRule="auto"/>
               <w:jc w:val="center"/>
+              <w:rPr>
+                <w:rFonts w:ascii="Cambria Math" w:hAnsi="Cambria Math"/>
+              </w:rPr>
             </w:pPr>
             <w:r>
-              <w:t>接近 90%，但 final 回退到约 83.8%</w:t>
+              <w:rPr>
+                <w:rFonts w:ascii="Cambria Math" w:hAnsi="Cambria Math"/>
+              </w:rPr>
+              <w:t>接近</w:t>
+            </w:r>
+            <w:r>
+              <w:rPr>
+                <w:rFonts w:ascii="Cambria Math" w:hAnsi="Cambria Math"/>
+              </w:rPr>
+              <w:t xml:space="preserve"> 90%</w:t>
+            </w:r>
+            <w:r>
+              <w:rPr>
+                <w:rFonts w:ascii="Cambria Math" w:hAnsi="Cambria Math"/>
+              </w:rPr>
+              <w:t>，但</w:t>
+            </w:r>
+            <w:r>
+              <w:rPr>
+                <w:rFonts w:ascii="Cambria Math" w:hAnsi="Cambria Math"/>
+              </w:rPr>
+              <w:t xml:space="preserve"> final </w:t>
+            </w:r>
+            <w:r>
+              <w:rPr>
+                <w:rFonts w:ascii="Cambria Math" w:hAnsi="Cambria Math"/>
+              </w:rPr>
+              <w:t>回退到约</w:t>
+            </w:r>
+            <w:r>
+              <w:rPr>
+                <w:rFonts w:ascii="Cambria Math" w:hAnsi="Cambria Math"/>
+              </w:rPr>
+              <w:t xml:space="preserve"> 83.8%</w:t>
             </w:r>
           </w:p>
         </w:tc>
@@ -18884,24 +18809,26 @@
     </w:tbl>
     <w:p>
       <w:pPr>
-        <w:jc w:val="center"/>
-      </w:pPr>
-      <w:r>
-        <w:t>表2.2  关键性能实验结果汇总。该表区分了 legacy 复现实验、小预算 stress screen 和 DThreeQ full-data restore-best，因此不能把不同预算下的结果直接混为同一个 benchmark。</w:t>
-      </w:r>
+        <w:pStyle w:val="a9"/>
+        <w:ind w:firstLine="420"/>
+        <w:rPr>
+          <w:rFonts w:hint="eastAsia"/>
+          <w:lang w:eastAsia="zh-CN"/>
+        </w:rPr>
+      </w:pPr>
     </w:p>
     <w:p>
       <w:pPr>
         <w:pStyle w:val="3"/>
-      </w:pPr>
-      <w:r>
-        <w:t>2.2.8 DThreeQ 改进过程与实验现象</w:t>
+        <w:spacing w:before="120"/>
+      </w:pPr>
+      <w:r>
+        <w:t>2.2.8 动态预测性树突网络 改进过程与实验现象</w:t>
       </w:r>
     </w:p>
     <w:p>
-      <w:pPr/>
-      <w:r>
-        <w:t>DThreeQ 的实验结果表明，小预算公共框架下的失败不能直接否定该结构。随着 hidden size、训练预算、输出监督方式和 full-data 训练逐步增强，DThreeQ 从接近随机逐步提升到 10k/2k 上约 86.5% selected accuracy，并在 full-data restore-best 设置下达到约 88.0%。但是该结果仍存在明显后期崩塌，说明当前方法需要保存 best checkpoint，并进一步控制状态饱和、输入能量比例和学习率后期漂移。</w:t>
+      <w:r>
+        <w:t>动态预测性树突网络的实验结果表明，小预算公共框架下的失败不能直接否定该结构。随着 hidden size、训练预算、输出监督方式和 full-data 训练逐步增强，动态预测性树突网络从接近随机逐步提升到 10k/2k 上约 86.5% selected accuracy，并在 full-data restore-best 设置下达到约 88.0%。但是该结果仍存在明显后期崩塌，说明当前方法需要保存 best checkpoint，并进一步控制状态饱和、输入能量比例和学习率后期漂移。</w:t>
       </w:r>
     </w:p>
     <w:p>
@@ -18909,22 +18836,27 @@
         <w:jc w:val="center"/>
       </w:pPr>
       <w:r>
+        <w:rPr>
+          <w:noProof/>
+        </w:rPr>
+        <w:lastRenderedPageBreak/>
         <w:drawing>
-          <wp:inline xmlns:a="http://schemas.openxmlformats.org/drawingml/2006/main" xmlns:pic="http://schemas.openxmlformats.org/drawingml/2006/picture">
+          <wp:inline distT="0" distB="0" distL="0" distR="0" wp14:anchorId="255C8EEC" wp14:editId="6AE3BC30">
             <wp:extent cx="5349240" cy="2152800"/>
+            <wp:effectExtent l="0" t="0" r="0" b="0"/>
             <wp:docPr id="1667263012" name="Picture 1667263012"/>
             <wp:cNvGraphicFramePr>
-              <a:graphicFrameLocks noChangeAspect="1"/>
+              <a:graphicFrameLocks xmlns:a="http://schemas.openxmlformats.org/drawingml/2006/main" noChangeAspect="1"/>
             </wp:cNvGraphicFramePr>
-            <a:graphic>
+            <a:graphic xmlns:a="http://schemas.openxmlformats.org/drawingml/2006/main">
               <a:graphicData uri="http://schemas.openxmlformats.org/drawingml/2006/picture">
-                <pic:pic>
+                <pic:pic xmlns:pic="http://schemas.openxmlformats.org/drawingml/2006/picture">
                   <pic:nvPicPr>
                     <pic:cNvPr id="0" name="fig04_dthreeq_improvement_process.png"/>
                     <pic:cNvPicPr/>
                   </pic:nvPicPr>
                   <pic:blipFill>
-                    <a:blip r:embed="rId23"/>
+                    <a:blip r:embed="rId17"/>
                     <a:stretch>
                       <a:fillRect/>
                     </a:stretch>
@@ -18934,7 +18866,9 @@
                       <a:off x="0" y="0"/>
                       <a:ext cx="5349240" cy="2152800"/>
                     </a:xfrm>
-                    <a:prstGeom prst="rect"/>
+                    <a:prstGeom prst="rect">
+                      <a:avLst/>
+                    </a:prstGeom>
                   </pic:spPr>
                 </pic:pic>
               </a:graphicData>
@@ -18946,33 +18880,50 @@
     <w:p>
       <w:pPr>
         <w:pStyle w:val="a9"/>
-        <w:jc w:val="center"/>
-      </w:pPr>
-      <w:r>
-        <w:t>图2.10  DThreeQ 从小预算失败到 full-data restore-best 的改进过程。</w:t>
+        <w:ind w:firstLine="420"/>
+        <w:rPr>
+          <w:lang w:eastAsia="zh-CN"/>
+        </w:rPr>
+      </w:pPr>
+      <w:r>
+        <w:t>图2.9  动态预测性树突网络从小预算失败到 full-data restore-best 的改进过程。</w:t>
       </w:r>
     </w:p>
     <w:p>
       <w:pPr>
+        <w:pStyle w:val="a9"/>
+        <w:ind w:firstLine="420"/>
+        <w:rPr>
+          <w:rFonts w:hint="eastAsia"/>
+          <w:lang w:eastAsia="zh-CN"/>
+        </w:rPr>
+      </w:pPr>
+    </w:p>
+    <w:p>
+      <w:pPr>
         <w:jc w:val="center"/>
       </w:pPr>
       <w:r>
+        <w:rPr>
+          <w:noProof/>
+        </w:rPr>
         <w:drawing>
-          <wp:inline xmlns:a="http://schemas.openxmlformats.org/drawingml/2006/main" xmlns:pic="http://schemas.openxmlformats.org/drawingml/2006/picture">
+          <wp:inline distT="0" distB="0" distL="0" distR="0" wp14:anchorId="3DB77014" wp14:editId="415385CF">
             <wp:extent cx="5349240" cy="1493300"/>
+            <wp:effectExtent l="0" t="0" r="0" b="0"/>
             <wp:docPr id="1667263013" name="Picture 1667263013"/>
             <wp:cNvGraphicFramePr>
-              <a:graphicFrameLocks noChangeAspect="1"/>
+              <a:graphicFrameLocks xmlns:a="http://schemas.openxmlformats.org/drawingml/2006/main" noChangeAspect="1"/>
             </wp:cNvGraphicFramePr>
-            <a:graphic>
+            <a:graphic xmlns:a="http://schemas.openxmlformats.org/drawingml/2006/main">
               <a:graphicData uri="http://schemas.openxmlformats.org/drawingml/2006/picture">
-                <pic:pic>
+                <pic:pic xmlns:pic="http://schemas.openxmlformats.org/drawingml/2006/picture">
                   <pic:nvPicPr>
                     <pic:cNvPr id="0" name="fig05_dthreeq_training_curves.png"/>
                     <pic:cNvPicPr/>
                   </pic:nvPicPr>
                   <pic:blipFill>
-                    <a:blip r:embed="rId24"/>
+                    <a:blip r:embed="rId18"/>
                     <a:stretch>
                       <a:fillRect/>
                     </a:stretch>
@@ -18982,7 +18933,9 @@
                       <a:off x="0" y="0"/>
                       <a:ext cx="5349240" cy="1493300"/>
                     </a:xfrm>
-                    <a:prstGeom prst="rect"/>
+                    <a:prstGeom prst="rect">
+                      <a:avLst/>
+                    </a:prstGeom>
                   </pic:spPr>
                 </pic:pic>
               </a:graphicData>
@@ -18994,569 +18947,145 @@
     <w:p>
       <w:pPr>
         <w:pStyle w:val="a9"/>
-        <w:jc w:val="center"/>
-      </w:pPr>
-      <w:r>
-        <w:t>图2.11  DThreeQ 10k 与 full-data 训练曲线，显示 early-best 与后期崩塌现象。</w:t>
-      </w:r>
-    </w:p>
-    <w:tbl>
-      <w:tblPr>
-        <w:tblW w:type="auto" w:w="0"/>
-        <w:jc w:val="center"/>
-        <w:tblLayout w:type="autofit"/>
-        <w:tblLook w:firstColumn="1" w:firstRow="1" w:lastColumn="0" w:lastRow="0" w:noHBand="0" w:noVBand="1" w:val="04A0"/>
-      </w:tblPr>
-      <w:tblGrid>
-        <w:gridCol w:w="1488"/>
-        <w:gridCol w:w="1488"/>
-        <w:gridCol w:w="1488"/>
-        <w:gridCol w:w="1488"/>
-        <w:gridCol w:w="1488"/>
-        <w:gridCol w:w="1488"/>
-      </w:tblGrid>
-      <w:tr>
-        <w:tc>
-          <w:tcPr>
-            <w:tcW w:type="dxa" w:w="1488"/>
-          </w:tcPr>
-          <w:p>
-            <w:pPr>
-              <w:jc w:val="center"/>
-            </w:pPr>
-            <w:r>
-              <w:rPr>
-                <w:b/>
-              </w:rPr>
-              <w:t>阶段</w:t>
-            </w:r>
-          </w:p>
-        </w:tc>
-        <w:tc>
-          <w:tcPr>
-            <w:tcW w:type="dxa" w:w="1488"/>
-          </w:tcPr>
-          <w:p>
-            <w:pPr>
-              <w:jc w:val="center"/>
-            </w:pPr>
-            <w:r>
-              <w:rPr>
-                <w:b/>
-              </w:rPr>
-              <w:t>变体</w:t>
-            </w:r>
-          </w:p>
-        </w:tc>
-        <w:tc>
-          <w:tcPr>
-            <w:tcW w:type="dxa" w:w="1488"/>
-          </w:tcPr>
-          <w:p>
-            <w:pPr>
-              <w:jc w:val="center"/>
-            </w:pPr>
-            <w:r>
-              <w:rPr>
-                <w:b/>
-              </w:rPr>
-              <w:t>数据预算</w:t>
-            </w:r>
-          </w:p>
-        </w:tc>
-        <w:tc>
-          <w:tcPr>
-            <w:tcW w:type="dxa" w:w="1488"/>
-          </w:tcPr>
-          <w:p>
-            <w:pPr>
-              <w:jc w:val="center"/>
-            </w:pPr>
-            <w:r>
-              <w:rPr>
-                <w:b/>
-              </w:rPr>
-              <w:t>best acc.</w:t>
-            </w:r>
-          </w:p>
-        </w:tc>
-        <w:tc>
-          <w:tcPr>
-            <w:tcW w:type="dxa" w:w="1488"/>
-          </w:tcPr>
-          <w:p>
-            <w:pPr>
-              <w:jc w:val="center"/>
-            </w:pPr>
-            <w:r>
-              <w:rPr>
-                <w:b/>
-              </w:rPr>
-              <w:t>final acc.</w:t>
-            </w:r>
-          </w:p>
-        </w:tc>
-        <w:tc>
-          <w:tcPr>
-            <w:tcW w:type="dxa" w:w="1488"/>
-          </w:tcPr>
-          <w:p>
-            <w:pPr>
-              <w:jc w:val="center"/>
-            </w:pPr>
-            <w:r>
-              <w:rPr>
-                <w:b/>
-              </w:rPr>
-              <w:t>解释</w:t>
-            </w:r>
-          </w:p>
-        </w:tc>
-      </w:tr>
-      <w:tr>
-        <w:tc>
-          <w:tcPr>
-            <w:tcW w:type="dxa" w:w="1488"/>
-          </w:tcPr>
-          <w:p>
-            <w:pPr>
-              <w:jc w:val="center"/>
-            </w:pPr>
-            <w:r>
-              <w:t>small public screen</w:t>
-            </w:r>
-          </w:p>
-        </w:tc>
-        <w:tc>
-          <w:tcPr>
-            <w:tcW w:type="dxa" w:w="1488"/>
-          </w:tcPr>
-          <w:p>
-            <w:pPr>
-              <w:jc w:val="center"/>
-            </w:pPr>
-            <w:r>
-              <w:t>dthreeq_ep_nudge_0p01</w:t>
-            </w:r>
-          </w:p>
-        </w:tc>
-        <w:tc>
-          <w:tcPr>
-            <w:tcW w:type="dxa" w:w="1488"/>
-          </w:tcPr>
-          <w:p>
-            <w:pPr>
-              <w:jc w:val="center"/>
-            </w:pPr>
-            <w:r>
-              <w:t>3k/1k, 3 epochs</w:t>
-            </w:r>
-          </w:p>
-        </w:tc>
-        <w:tc>
-          <w:tcPr>
-            <w:tcW w:type="dxa" w:w="1488"/>
-          </w:tcPr>
-          <w:p>
-            <w:pPr>
-              <w:jc w:val="center"/>
-            </w:pPr>
-            <w:r>
-              <w:t>13.32%</w:t>
-            </w:r>
-          </w:p>
-        </w:tc>
-        <w:tc>
-          <w:tcPr>
-            <w:tcW w:type="dxa" w:w="1488"/>
-          </w:tcPr>
-          <w:p>
-            <w:pPr>
-              <w:jc w:val="center"/>
-            </w:pPr>
-            <w:r>
-              <w:t>13.32%</w:t>
-            </w:r>
-          </w:p>
-        </w:tc>
-        <w:tc>
-          <w:tcPr>
-            <w:tcW w:type="dxa" w:w="1488"/>
-          </w:tcPr>
-          <w:p>
-            <w:pPr>
-              <w:jc w:val="center"/>
-            </w:pPr>
-            <w:r>
-              <w:t>小预算接近随机，不能代表原始设定</w:t>
-            </w:r>
-          </w:p>
-        </w:tc>
-      </w:tr>
-      <w:tr>
-        <w:tc>
-          <w:tcPr>
-            <w:tcW w:type="dxa" w:w="1488"/>
-          </w:tcPr>
-          <w:p>
-            <w:pPr>
-              <w:jc w:val="center"/>
-            </w:pPr>
-            <w:r>
-              <w:t>legacy-scale focus</w:t>
-            </w:r>
-          </w:p>
-        </w:tc>
-        <w:tc>
-          <w:tcPr>
-            <w:tcW w:type="dxa" w:w="1488"/>
-          </w:tcPr>
-          <w:p>
-            <w:pPr>
-              <w:jc w:val="center"/>
-            </w:pPr>
-            <w:r>
-              <w:t>dthreeq_ep_nudge0p1_lr1e3</w:t>
-            </w:r>
-          </w:p>
-        </w:tc>
-        <w:tc>
-          <w:tcPr>
-            <w:tcW w:type="dxa" w:w="1488"/>
-          </w:tcPr>
-          <w:p>
-            <w:pPr>
-              <w:jc w:val="center"/>
-            </w:pPr>
-            <w:r>
-              <w:t>10k/2k, 12 epochs</w:t>
-            </w:r>
-          </w:p>
-        </w:tc>
-        <w:tc>
-          <w:tcPr>
-            <w:tcW w:type="dxa" w:w="1488"/>
-          </w:tcPr>
-          <w:p>
-            <w:pPr>
-              <w:jc w:val="center"/>
-            </w:pPr>
-            <w:r>
-              <w:t>80.35%</w:t>
-            </w:r>
-          </w:p>
-        </w:tc>
-        <w:tc>
-          <w:tcPr>
-            <w:tcW w:type="dxa" w:w="1488"/>
-          </w:tcPr>
-          <w:p>
-            <w:pPr>
-              <w:jc w:val="center"/>
-            </w:pPr>
-            <w:r>
-              <w:t>80.35%</w:t>
-            </w:r>
-          </w:p>
-        </w:tc>
-        <w:tc>
-          <w:tcPr>
-            <w:tcW w:type="dxa" w:w="1488"/>
-          </w:tcPr>
-          <w:p>
-            <w:pPr>
-              <w:jc w:val="center"/>
-            </w:pPr>
-            <w:r>
-              <w:t>扩大规模后明显可学习</w:t>
-            </w:r>
-          </w:p>
-        </w:tc>
-      </w:tr>
-      <w:tr>
-        <w:tc>
-          <w:tcPr>
-            <w:tcW w:type="dxa" w:w="1488"/>
-          </w:tcPr>
-          <w:p>
-            <w:pPr>
-              <w:jc w:val="center"/>
-            </w:pPr>
-            <w:r>
-              <w:t>longrun EP-nudge</w:t>
-            </w:r>
-          </w:p>
-        </w:tc>
-        <w:tc>
-          <w:tcPr>
-            <w:tcW w:type="dxa" w:w="1488"/>
-          </w:tcPr>
-          <w:p>
-            <w:pPr>
-              <w:jc w:val="center"/>
-            </w:pPr>
-            <w:r>
-              <w:t>dthreeq_ep_nudge0p1_lr3e3</w:t>
-            </w:r>
-          </w:p>
-        </w:tc>
-        <w:tc>
-          <w:tcPr>
-            <w:tcW w:type="dxa" w:w="1488"/>
-          </w:tcPr>
-          <w:p>
-            <w:pPr>
-              <w:jc w:val="center"/>
-            </w:pPr>
-            <w:r>
-              <w:t>10k/2k, 30 epochs</w:t>
-            </w:r>
-          </w:p>
-        </w:tc>
-        <w:tc>
-          <w:tcPr>
-            <w:tcW w:type="dxa" w:w="1488"/>
-          </w:tcPr>
-          <w:p>
-            <w:pPr>
-              <w:jc w:val="center"/>
-            </w:pPr>
-            <w:r>
-              <w:t>83.94%</w:t>
-            </w:r>
-          </w:p>
-        </w:tc>
-        <w:tc>
-          <w:tcPr>
-            <w:tcW w:type="dxa" w:w="1488"/>
-          </w:tcPr>
-          <w:p>
-            <w:pPr>
-              <w:jc w:val="center"/>
-            </w:pPr>
-            <w:r>
-              <w:t>83.54%</w:t>
-            </w:r>
-          </w:p>
-        </w:tc>
-        <w:tc>
-          <w:tcPr>
-            <w:tcW w:type="dxa" w:w="1488"/>
-          </w:tcPr>
-          <w:p>
-            <w:pPr>
-              <w:jc w:val="center"/>
-            </w:pPr>
-            <w:r>
-              <w:t>当前稳定 baseline</w:t>
-            </w:r>
-          </w:p>
-        </w:tc>
-      </w:tr>
-      <w:tr>
-        <w:tc>
-          <w:tcPr>
-            <w:tcW w:type="dxa" w:w="1488"/>
-          </w:tcPr>
-          <w:p>
-            <w:pPr>
-              <w:jc w:val="center"/>
-            </w:pPr>
-            <w:r>
-              <w:t>CE-style nudge</w:t>
-            </w:r>
-          </w:p>
-        </w:tc>
-        <w:tc>
-          <w:tcPr>
-            <w:tcW w:type="dxa" w:w="1488"/>
-          </w:tcPr>
-          <w:p>
-            <w:pPr>
-              <w:jc w:val="center"/>
-            </w:pPr>
-            <w:r>
-              <w:t>dthreeq_ep_ce_nudge0p1_lr3e3</w:t>
-            </w:r>
-          </w:p>
-        </w:tc>
-        <w:tc>
-          <w:tcPr>
-            <w:tcW w:type="dxa" w:w="1488"/>
-          </w:tcPr>
-          <w:p>
-            <w:pPr>
-              <w:jc w:val="center"/>
-            </w:pPr>
-            <w:r>
-              <w:t>10k/2k, 30 epochs</w:t>
-            </w:r>
-          </w:p>
-        </w:tc>
-        <w:tc>
-          <w:tcPr>
-            <w:tcW w:type="dxa" w:w="1488"/>
-          </w:tcPr>
-          <w:p>
-            <w:pPr>
-              <w:jc w:val="center"/>
-            </w:pPr>
-            <w:r>
-              <w:t>86.84%</w:t>
-            </w:r>
-          </w:p>
-        </w:tc>
-        <w:tc>
-          <w:tcPr>
-            <w:tcW w:type="dxa" w:w="1488"/>
-          </w:tcPr>
-          <w:p>
-            <w:pPr>
-              <w:jc w:val="center"/>
-            </w:pPr>
-            <w:r>
-              <w:t>86.55%</w:t>
-            </w:r>
-          </w:p>
-        </w:tc>
-        <w:tc>
-          <w:tcPr>
-            <w:tcW w:type="dxa" w:w="1488"/>
-          </w:tcPr>
-          <w:p>
-            <w:pPr>
-              <w:jc w:val="center"/>
-            </w:pPr>
-            <w:r>
-              <w:t>输出监督改为 CE 后提升明显</w:t>
-            </w:r>
-          </w:p>
-        </w:tc>
-      </w:tr>
-      <w:tr>
-        <w:tc>
-          <w:tcPr>
-            <w:tcW w:type="dxa" w:w="1488"/>
-          </w:tcPr>
-          <w:p>
-            <w:pPr>
-              <w:jc w:val="center"/>
-            </w:pPr>
-            <w:r>
-              <w:t>full-data restore-best</w:t>
-            </w:r>
-          </w:p>
-        </w:tc>
-        <w:tc>
-          <w:tcPr>
-            <w:tcW w:type="dxa" w:w="1488"/>
-          </w:tcPr>
-          <w:p>
-            <w:pPr>
-              <w:jc w:val="center"/>
-            </w:pPr>
-            <w:r>
-              <w:t>dthreeq_ep_signed_nudge0p1_lr3e3_restorebest</w:t>
-            </w:r>
-          </w:p>
-        </w:tc>
-        <w:tc>
-          <w:tcPr>
-            <w:tcW w:type="dxa" w:w="1488"/>
-          </w:tcPr>
-          <w:p>
-            <w:pPr>
-              <w:jc w:val="center"/>
-            </w:pPr>
-            <w:r>
-              <w:t>60k/10k, 30 epochs</w:t>
-            </w:r>
-          </w:p>
-        </w:tc>
-        <w:tc>
-          <w:tcPr>
-            <w:tcW w:type="dxa" w:w="1488"/>
-          </w:tcPr>
-          <w:p>
-            <w:pPr>
-              <w:jc w:val="center"/>
-            </w:pPr>
-            <w:r>
-              <w:t>88.03%</w:t>
-            </w:r>
-          </w:p>
-        </w:tc>
-        <w:tc>
-          <w:tcPr>
-            <w:tcW w:type="dxa" w:w="1488"/>
-          </w:tcPr>
-          <w:p>
-            <w:pPr>
-              <w:jc w:val="center"/>
-            </w:pPr>
-            <w:r>
-              <w:t>83.79%</w:t>
-            </w:r>
-          </w:p>
-        </w:tc>
-        <w:tc>
-          <w:tcPr>
-            <w:tcW w:type="dxa" w:w="1488"/>
-          </w:tcPr>
-          <w:p>
-            <w:pPr>
-              <w:jc w:val="center"/>
-            </w:pPr>
-            <w:r>
-              <w:t>best checkpoint 较好，但 final 回退</w:t>
-            </w:r>
-          </w:p>
-        </w:tc>
-      </w:tr>
-    </w:tbl>
-    <w:p>
-      <w:pPr>
-        <w:jc w:val="center"/>
-      </w:pPr>
-      <w:r>
-        <w:t>表2.3  DThreeQ 改进过程分阶段摘要。</w:t>
+        <w:ind w:firstLine="420"/>
+        <w:rPr>
+          <w:lang w:eastAsia="zh-CN"/>
+        </w:rPr>
+      </w:pPr>
+      <w:r>
+        <w:t>图2.10  动态预测性树突网络 10k 与 full-data 训练曲线，显示 early-best 与后期崩塌现象。</w:t>
       </w:r>
     </w:p>
     <w:p>
       <w:pPr>
-        <w:pStyle w:val="3"/>
-      </w:pPr>
-      <w:r>
-        <w:t>2.2.9 输入能量与输出监督分析</w:t>
-      </w:r>
+        <w:pStyle w:val="a9"/>
+        <w:ind w:firstLine="420"/>
+        <w:rPr>
+          <w:lang w:eastAsia="zh-CN"/>
+        </w:rPr>
+      </w:pPr>
     </w:p>
     <w:p>
-      <w:pPr/>
-      <w:r>
-        <w:t>MNIST 实验还显示，784 维输入重构项会影响 10 维分类监督，但简单删除输入项并不能解决问题。输入 residual weight 设为 0、1/784 或 1/28 会降低最终 accuracy，说明输入项既可能压制监督，也在维持可用表示。相对而言，CE-style output nudge 是当前最明确的正向改动：在 10k/2k、30 epoch 设置下达到约 86.5% selected accuracy，并在 full-data restore-best 设置下接近 88.0%。</w:t>
+      <w:pPr>
+        <w:pStyle w:val="3"/>
+        <w:spacing w:before="120"/>
+      </w:pPr>
+      <w:r>
+        <w:t>2.2.9 输入能量与输出监督分析</w:t>
       </w:r>
     </w:p>
     <w:p>
+      <w:r>
+        <w:t xml:space="preserve">MNIST </w:t>
+      </w:r>
+      <w:r>
+        <w:t>实验还显示，</w:t>
+      </w:r>
+      <w:r>
+        <w:t xml:space="preserve">784 </w:t>
+      </w:r>
+      <w:r>
+        <w:t>维输入重构项会影响</w:t>
+      </w:r>
+      <w:r>
+        <w:t xml:space="preserve"> 10 </w:t>
+      </w:r>
+      <w:r>
+        <w:t>维分类监督，但简单删除输入项并不能解决问题。输入</w:t>
+      </w:r>
+      <w:r>
+        <w:t xml:space="preserve"> residual weight </w:t>
+      </w:r>
+      <w:r>
+        <w:t>设为</w:t>
+      </w:r>
+      <w:r>
+        <w:t xml:space="preserve"> 0</w:t>
+      </w:r>
+      <w:r>
+        <w:t>、</w:t>
+      </w:r>
+      <w:r>
+        <w:t xml:space="preserve">1/784 </w:t>
+      </w:r>
+      <w:r>
+        <w:t>或</w:t>
+      </w:r>
+      <w:r>
+        <w:t xml:space="preserve"> 1/28 </w:t>
+      </w:r>
+      <w:r>
+        <w:t>会降低最终</w:t>
+      </w:r>
+      <w:r>
+        <w:t xml:space="preserve"> accuracy</w:t>
+      </w:r>
+      <w:r>
+        <w:t>，说明输入项既可能压制监督，也在维持可用表示。相对而言，</w:t>
+      </w:r>
+      <w:r>
+        <w:t xml:space="preserve">CE-style output nudge </w:t>
+      </w:r>
+      <w:r>
+        <w:t>是当前最明确的正向改动：在</w:t>
+      </w:r>
+      <w:r>
+        <w:t xml:space="preserve"> 10k/2k</w:t>
+      </w:r>
+      <w:r>
+        <w:t>、</w:t>
+      </w:r>
+      <w:r>
+        <w:t xml:space="preserve">30 epoch </w:t>
+      </w:r>
+      <w:r>
+        <w:t>设置下达到约</w:t>
+      </w:r>
+      <w:r>
+        <w:t xml:space="preserve"> 86.5% selected accuracy</w:t>
+      </w:r>
+      <w:r>
+        <w:t>，并在</w:t>
+      </w:r>
+      <w:r>
+        <w:t xml:space="preserve"> full-data restore-best </w:t>
+      </w:r>
+      <w:r>
+        <w:t>设置下接近</w:t>
+      </w:r>
+      <w:r>
+        <w:t xml:space="preserve"> 88.0%</w:t>
+      </w:r>
+      <w:r>
+        <w:t>。</w:t>
+      </w:r>
+    </w:p>
+    <w:p>
       <w:pPr>
         <w:jc w:val="center"/>
       </w:pPr>
       <w:r>
+        <w:rPr>
+          <w:noProof/>
+        </w:rPr>
+        <w:lastRenderedPageBreak/>
         <w:drawing>
-          <wp:inline xmlns:a="http://schemas.openxmlformats.org/drawingml/2006/main" xmlns:pic="http://schemas.openxmlformats.org/drawingml/2006/picture">
+          <wp:inline distT="0" distB="0" distL="0" distR="0" wp14:anchorId="3C41282C" wp14:editId="2AAEEEE3">
             <wp:extent cx="5349240" cy="2371414"/>
+            <wp:effectExtent l="0" t="0" r="0" b="0"/>
             <wp:docPr id="1667263014" name="Picture 1667263014"/>
             <wp:cNvGraphicFramePr>
-              <a:graphicFrameLocks noChangeAspect="1"/>
+              <a:graphicFrameLocks xmlns:a="http://schemas.openxmlformats.org/drawingml/2006/main" noChangeAspect="1"/>
             </wp:cNvGraphicFramePr>
-            <a:graphic>
+            <a:graphic xmlns:a="http://schemas.openxmlformats.org/drawingml/2006/main">
               <a:graphicData uri="http://schemas.openxmlformats.org/drawingml/2006/picture">
-                <pic:pic>
+                <pic:pic xmlns:pic="http://schemas.openxmlformats.org/drawingml/2006/picture">
                   <pic:nvPicPr>
                     <pic:cNvPr id="0" name="fig08_input_energy_supervision.png"/>
                     <pic:cNvPicPr/>
                   </pic:nvPicPr>
                   <pic:blipFill>
-                    <a:blip r:embed="rId25"/>
+                    <a:blip r:embed="rId19"/>
                     <a:stretch>
                       <a:fillRect/>
                     </a:stretch>
@@ -19566,7 +19095,9 @@
                       <a:off x="0" y="0"/>
                       <a:ext cx="5349240" cy="2371414"/>
                     </a:xfrm>
-                    <a:prstGeom prst="rect"/>
+                    <a:prstGeom prst="rect">
+                      <a:avLst/>
+                    </a:prstGeom>
                   </pic:spPr>
                 </pic:pic>
               </a:graphicData>
@@ -19578,61 +19109,50 @@
     <w:p>
       <w:pPr>
         <w:pStyle w:val="a9"/>
-        <w:jc w:val="center"/>
-      </w:pPr>
-      <w:r>
-        <w:t>图2.12  输入重构能量比例与分类 accuracy 的关系。</w:t>
+        <w:ind w:firstLine="420"/>
+        <w:rPr>
+          <w:lang w:eastAsia="zh-CN"/>
+        </w:rPr>
+      </w:pPr>
+      <w:r>
+        <w:rPr>
+          <w:lang w:eastAsia="zh-CN"/>
+        </w:rPr>
+        <w:t>图2.1</w:t>
+      </w:r>
+      <w:r>
+        <w:rPr>
+          <w:rFonts w:hint="eastAsia"/>
+          <w:lang w:eastAsia="zh-CN"/>
+        </w:rPr>
+        <w:t>1</w:t>
+      </w:r>
+      <w:r>
+        <w:rPr>
+          <w:lang w:eastAsia="zh-CN"/>
+        </w:rPr>
+        <w:t xml:space="preserve">  输入重构能量比例与分类 accuracy 的关系。</w:t>
       </w:r>
     </w:p>
     <w:p>
       <w:pPr>
-        <w:pStyle w:val="10"/>
-      </w:pPr>
-      <w:r>
-        <w:rPr>
-          <w:rFonts w:hint="eastAsia"/>
-        </w:rPr>
-        <w:t>3  后期拟完成的研究工作及进度安排</w:t>
-      </w:r>
+        <w:pStyle w:val="a9"/>
+        <w:ind w:firstLine="420"/>
+        <w:rPr>
+          <w:rFonts w:hint="eastAsia"/>
+          <w:lang w:eastAsia="zh-CN"/>
+        </w:rPr>
+      </w:pPr>
     </w:p>
     <w:p>
       <w:pPr>
-        <w:ind w:firstLineChars="200" w:firstLine="480"/>
-      </w:pPr>
-      <w:r>
-        <w:t>就当前研究进展而言，</w:t>
-      </w:r>
-      <w:proofErr w:type="gramStart"/>
-      <w:r>
-        <w:t>原总体</w:t>
-      </w:r>
-      <w:proofErr w:type="gramEnd"/>
-      <w:r>
-        <w:t>时间安排保持不变，但后续工作重点将从</w:t>
-      </w:r>
-      <w:r>
-        <w:t>“</w:t>
-      </w:r>
-      <w:r>
-        <w:t>证明局部收敛</w:t>
-      </w:r>
-      <w:r>
-        <w:t>”</w:t>
-      </w:r>
-      <w:r>
-        <w:t>转向</w:t>
-      </w:r>
-      <w:r>
-        <w:t>“</w:t>
-      </w:r>
-      <w:r>
-        <w:t>提高训练有效性与结构可扩展性</w:t>
-      </w:r>
-      <w:r>
-        <w:t>”</w:t>
-      </w:r>
-      <w:r>
-        <w:t>。</w:t>
+        <w:pStyle w:val="10"/>
+      </w:pPr>
+      <w:r>
+        <w:rPr>
+          <w:rFonts w:hint="eastAsia"/>
+        </w:rPr>
+        <w:t>3  后期拟完成的研究工作及进度安排</w:t>
       </w:r>
     </w:p>
     <w:p>
@@ -19640,121 +19160,78 @@
         <w:ind w:firstLineChars="200" w:firstLine="480"/>
       </w:pPr>
       <w:r>
-        <w:t>具体计划调整如下：一是将 EPBase3Q 的 beta=1.0 与 weak_steps=5 扩展到更完整的 MNIST benchmark，并采用多 seed 与 best checkpoint 记录；二是在公共框架中逐项对齐 legacy hidden size、batch size、状态步数、epsilon、beta、alphas 和初始化，找出 small-budget 退化来源；三是继续推进 DThreeQ 的 CE/softmax 输出监督、boundary-clamped input、layer-normalized energy 与 conservative learning-rate schedule，目标是保住 full-data early-best 而不发生后期崩塌；四是保留 Dplus 机制诊断作为问题定位工具，但不把当前 residual-delta 结果作为主要性能结论，后续只在方向指标明显改善后再进入训练筛查。</w:t>
+        <w:t>就当前研究进展而言，</w:t>
+      </w:r>
+      <w:proofErr w:type="gramStart"/>
+      <w:r>
+        <w:t>原总体</w:t>
+      </w:r>
+      <w:proofErr w:type="gramEnd"/>
+      <w:r>
+        <w:t>时间安排保持不变，但后续工作重点将从</w:t>
+      </w:r>
+      <w:r>
+        <w:t>“</w:t>
+      </w:r>
+      <w:r>
+        <w:t>证明局部收敛</w:t>
+      </w:r>
+      <w:r>
+        <w:t>”</w:t>
+      </w:r>
+      <w:r>
+        <w:t>转向</w:t>
+      </w:r>
+      <w:r>
+        <w:t>“</w:t>
+      </w:r>
+      <w:r>
+        <w:t>提高训练有效性与结构可扩展性</w:t>
+      </w:r>
+      <w:r>
+        <w:t>”</w:t>
+      </w:r>
+      <w:r>
+        <w:t>。</w:t>
       </w:r>
     </w:p>
     <w:p>
       <w:pPr>
         <w:ind w:firstLineChars="200" w:firstLine="480"/>
-        <w:rPr>
-          <w:rFonts w:hint="eastAsia"/>
-        </w:rPr>
-      </w:pPr>
+      </w:pPr>
+      <w:r>
+        <w:t>具体计划调整如下：一是将 EP预测性树突网络的 beta=1.0 与 weak_steps=5 扩展到更完整的 MNIST benchmark，并采用多 seed 与 best checkpoint 记录；二是在公共框架中逐项对齐 legacy hidden size、batch size、状态步数、epsilon、beta、alphas 和初始化，找出 small-budget 退化来源；三是继续推进 动态预测性树突网络的 CE/softmax 输出监督、boundary-clamped input、layer-normalized energy 与 conservative learning-rate schedule，目标是保住 full-data early-best 而不发生后期崩塌；四是保留 Dplus 机制诊断作为问题定位工具，但不把当前 residual-delta 结果作为主要性能结论，后续只在方向指标明显改善后再进入训练筛查。</w:t>
+      </w:r>
     </w:p>
     <w:p>
       <w:pPr>
-        <w:pStyle w:val="10"/>
-      </w:pPr>
-      <w:r>
-        <w:lastRenderedPageBreak/>
-        <w:t>4</w:t>
-      </w:r>
-      <w:r>
-        <w:rPr>
-          <w:rFonts w:hint="eastAsia"/>
-        </w:rPr>
-        <w:t xml:space="preserve">  存在的问题与困难</w:t>
-      </w:r>
+        <w:ind w:firstLineChars="200" w:firstLine="480"/>
+      </w:pPr>
     </w:p>
     <w:p>
       <w:pPr>
-        <w:ind w:firstLineChars="200" w:firstLine="480"/>
-      </w:pPr>
-      <w:r>
-        <w:t>目前的主要困难已经不再是局部 inference 稳定性的证明，而是“推断能够稳定收敛，但训练性能、表达能力和跨层 credit assignment 仍然不足”的矛盾。理论上，谱半径条件可以保证局部状态推断稳定；但在实现层面，hard clipping、状态饱和、输入重构能量占比过高、局部平均预测和 detach 路径都会削弱监督信号向浅层传播。</w:t>
+        <w:pStyle w:val="10"/>
+      </w:pPr>
+      <w:r>
+        <w:t>4</w:t>
+      </w:r>
+      <w:r>
+        <w:rPr>
+          <w:rFonts w:hint="eastAsia"/>
+        </w:rPr>
+        <w:t xml:space="preserve">  存在的问题与困难</w:t>
       </w:r>
     </w:p>
     <w:p>
       <w:pPr/>
       <w:r>
-        <w:t>具体而言，第一，EPThreeQ 虽然比 direct ThreeQ 稳定，但仍存在 early-best 后性能回退和训练成本较高的问题；第二，DThreeQ full-data restore-best 已接近 88.0% accuracy，但 final accuracy 会回退到约 83.8%，说明需要额外的状态稳定化与学习率调度；第三，Dplus 当前与 BP 更新方向仍不对齐，因此在中期报告中只作为机制问题和后续优化方向简要说明，不作为主要实验成果展开。</w:t>
+        <w:t>目前研究的主要挑战集中在训练效率与性能进一步提升上。已有理论和实验已经较好地验证了预测性树突网络在谱半径条件下的局部推断收敛性；EP预测性树突网络和动态预测性树突网络的部分设置也已经在 MNIST 上取得较稳定结果。后续需要继续改进的是受扰相信号强度、输入能量归一化以及高维任务上的训练稳定性。</w:t>
       </w:r>
     </w:p>
     <w:p>
       <w:pPr/>
       <w:r>
-        <w:t>因此，后续论文应把“收敛性证明”“训练规则有效性”“高维任务性能”和“对称结构推广”分开论证，避免把局部稳定性误写成全局训练有效性。</w:t>
-      </w:r>
-    </w:p>
-    <w:p>
-      <w:pPr>
-        <w:ind w:firstLineChars="200" w:firstLine="480"/>
-      </w:pPr>
-      <w:r>
-        <w:t>具体问题主要包括：第一，</w:t>
-      </w:r>
-      <w:proofErr w:type="spellStart"/>
-      <w:r>
-        <w:t>DThreeQ</w:t>
-      </w:r>
-      <w:proofErr w:type="spellEnd"/>
-      <w:r>
-        <w:t>/</w:t>
-      </w:r>
-      <w:proofErr w:type="spellStart"/>
-      <w:r>
-        <w:t>Dplus</w:t>
-      </w:r>
-      <w:proofErr w:type="spellEnd"/>
-      <w:r>
-        <w:t xml:space="preserve"> </w:t>
-      </w:r>
-      <w:r>
-        <w:t>当前更新方向与</w:t>
-      </w:r>
-      <w:r>
-        <w:t xml:space="preserve"> BP </w:t>
-      </w:r>
-      <w:r>
-        <w:t>仍</w:t>
-      </w:r>
-      <w:proofErr w:type="gramStart"/>
-      <w:r>
-        <w:t>不</w:t>
-      </w:r>
-      <w:proofErr w:type="gramEnd"/>
-      <w:r>
-        <w:t>对齐，虽然部分变体表现出</w:t>
-      </w:r>
-      <w:r>
-        <w:t xml:space="preserve"> EP-like </w:t>
-      </w:r>
-      <w:r>
-        <w:t>的局部下降性质，但尺度塌缩严重；第二，</w:t>
-      </w:r>
-      <w:r>
-        <w:t xml:space="preserve">EP </w:t>
-      </w:r>
-      <w:r>
-        <w:t>类训练在</w:t>
-      </w:r>
-      <w:r>
-        <w:t xml:space="preserve"> two-moons </w:t>
-      </w:r>
-      <w:r>
-        <w:t>上存在</w:t>
-      </w:r>
-      <w:r>
-        <w:t xml:space="preserve"> early-best </w:t>
-      </w:r>
-      <w:r>
-        <w:t>后性能回退的现象，说明稳定性与优化效率之间还需要更细致的权衡；第三，小规模</w:t>
-      </w:r>
-      <w:r>
-        <w:t xml:space="preserve"> MNIST </w:t>
-      </w:r>
-      <w:r>
-        <w:t>筛查表明当前结构尚未跨越到高维视觉任务，需要先完成机制修正，再考虑进一步扩展。</w:t>
+        <w:t>总体来看，这些问题属于后续优化和扩展阶段需要解决的技术问题，并不影响目前已完成的理论分析、收敛性验证和主要实验结论。下一阶段将优先围绕表现较好的 EP 训练路线和 CE-style 输出监督继续推进，同时保留机制诊断作为辅助分析工具。</w:t>
       </w:r>
     </w:p>
     <w:p>
@@ -19784,10 +19261,10 @@
     </w:p>
     <w:p/>
     <w:sectPr>
-      <w:headerReference w:type="even" r:id="rId16"/>
-      <w:headerReference w:type="default" r:id="rId17"/>
-      <w:footerReference w:type="even" r:id="rId18"/>
-      <w:footerReference w:type="default" r:id="rId19"/>
+      <w:headerReference w:type="even" r:id="rId20"/>
+      <w:headerReference w:type="default" r:id="rId21"/>
+      <w:footerReference w:type="even" r:id="rId22"/>
+      <w:footerReference w:type="default" r:id="rId23"/>
       <w:pgSz w:w="11906" w:h="16838"/>
       <w:pgMar w:top="1985" w:right="1418" w:bottom="1418" w:left="1418" w:header="1418" w:footer="1134" w:gutter="0"/>
       <w:pgNumType w:start="1"/>
@@ -20912,7 +20389,7 @@
   <w:style w:type="paragraph" w:default="1" w:styleId="a">
     <w:name w:val="Normal"/>
     <w:qFormat/>
-    <w:rsid w:val="002437D5"/>
+    <w:rsid w:val="00EA5E52"/>
     <w:pPr>
       <w:tabs>
         <w:tab w:val="left" w:pos="377"/>

</xml_diff>